<commit_message>
Improve quiz parser - now extracts 10 topics
</commit_message>
<xml_diff>
--- a/public/word/3.docx
+++ b/public/word/3.docx
@@ -1,6 +1,6 @@
 
 <file path=word/document.xml><?xml version="1.0" encoding="utf-8"?>
-<w:document xmlns:wpc="http://schemas.microsoft.com/office/word/2010/wordprocessingCanvas" xmlns:cx="http://schemas.microsoft.com/office/drawing/2014/chartex" xmlns:mc="http://schemas.openxmlformats.org/markup-compatibility/2006" xmlns:o="urn:schemas-microsoft-com:office:office" xmlns:r="http://schemas.openxmlformats.org/officeDocument/2006/relationships" xmlns:m="http://schemas.openxmlformats.org/officeDocument/2006/math" xmlns:v="urn:schemas-microsoft-com:vml" xmlns:wp14="http://schemas.microsoft.com/office/word/2010/wordprocessingDrawing" xmlns:wp="http://schemas.openxmlformats.org/drawingml/2006/wordprocessingDrawing" xmlns:w10="urn:schemas-microsoft-com:office:word" xmlns:w="http://schemas.openxmlformats.org/wordprocessingml/2006/main" xmlns:w14="http://schemas.microsoft.com/office/word/2010/wordml" xmlns:w15="http://schemas.microsoft.com/office/word/2012/wordml" xmlns:w16se="http://schemas.microsoft.com/office/word/2015/wordml/symex" xmlns:wpg="http://schemas.microsoft.com/office/word/2010/wordprocessingGroup" xmlns:wpi="http://schemas.microsoft.com/office/word/2010/wordprocessingInk" xmlns:wne="http://schemas.microsoft.com/office/word/2006/wordml" xmlns:wps="http://schemas.microsoft.com/office/word/2010/wordprocessingShape" mc:Ignorable="w14 w15 w16se wp14">
+<w:document xmlns:wpc="http://schemas.microsoft.com/office/word/2010/wordprocessingCanvas" xmlns:cx="http://schemas.microsoft.com/office/drawing/2014/chartex" xmlns:cx1="http://schemas.microsoft.com/office/drawing/2015/9/8/chartex" xmlns:cx2="http://schemas.microsoft.com/office/drawing/2015/10/21/chartex" xmlns:cx3="http://schemas.microsoft.com/office/drawing/2016/5/9/chartex" xmlns:cx4="http://schemas.microsoft.com/office/drawing/2016/5/10/chartex" xmlns:cx5="http://schemas.microsoft.com/office/drawing/2016/5/11/chartex" xmlns:cx6="http://schemas.microsoft.com/office/drawing/2016/5/12/chartex" xmlns:cx7="http://schemas.microsoft.com/office/drawing/2016/5/13/chartex" xmlns:cx8="http://schemas.microsoft.com/office/drawing/2016/5/14/chartex" xmlns:mc="http://schemas.openxmlformats.org/markup-compatibility/2006" xmlns:aink="http://schemas.microsoft.com/office/drawing/2016/ink" xmlns:am3d="http://schemas.microsoft.com/office/drawing/2017/model3d" xmlns:o="urn:schemas-microsoft-com:office:office" xmlns:oel="http://schemas.microsoft.com/office/2019/extlst" xmlns:r="http://schemas.openxmlformats.org/officeDocument/2006/relationships" xmlns:m="http://schemas.openxmlformats.org/officeDocument/2006/math" xmlns:v="urn:schemas-microsoft-com:vml" xmlns:wp14="http://schemas.microsoft.com/office/word/2010/wordprocessingDrawing" xmlns:wp="http://schemas.openxmlformats.org/drawingml/2006/wordprocessingDrawing" xmlns:w10="urn:schemas-microsoft-com:office:word" xmlns:w="http://schemas.openxmlformats.org/wordprocessingml/2006/main" xmlns:w14="http://schemas.microsoft.com/office/word/2010/wordml" xmlns:w15="http://schemas.microsoft.com/office/word/2012/wordml" xmlns:w16cex="http://schemas.microsoft.com/office/word/2018/wordml/cex" xmlns:w16cid="http://schemas.microsoft.com/office/word/2016/wordml/cid" xmlns:w16="http://schemas.microsoft.com/office/word/2018/wordml" xmlns:w16sdtdh="http://schemas.microsoft.com/office/word/2020/wordml/sdtdatahash" xmlns:w16se="http://schemas.microsoft.com/office/word/2015/wordml/symex" xmlns:wpg="http://schemas.microsoft.com/office/word/2010/wordprocessingGroup" xmlns:wpi="http://schemas.microsoft.com/office/word/2010/wordprocessingInk" xmlns:wne="http://schemas.microsoft.com/office/word/2006/wordml" xmlns:wps="http://schemas.microsoft.com/office/word/2010/wordprocessingShape" mc:Ignorable="w14 w15 w16se w16cid w16 w16cex w16sdtdh wp14">
   <w:body>
     <w:p>
       <w:pPr>
@@ -196,8 +196,6 @@
         </w:rPr>
         <w:t>Преимущества</w:t>
       </w:r>
-      <w:bookmarkStart w:id="0" w:name="_GoBack"/>
-      <w:bookmarkEnd w:id="0"/>
     </w:p>
     <w:p>
       <w:pPr>
@@ -1532,27 +1530,15 @@
           <w:lang w:val="ru-RU"/>
         </w:rPr>
       </w:pPr>
-      <w:proofErr w:type="gramStart"/>
-      <w:r>
-        <w:rPr>
-          <w:rFonts w:ascii="Times New Roman" w:eastAsia="Times New Roman" w:hAnsi="Times New Roman" w:cs="Times New Roman"/>
-          <w:color w:val="111111"/>
-          <w:sz w:val="28"/>
-          <w:szCs w:val="28"/>
-          <w:lang w:val="ru-RU"/>
-        </w:rPr>
-        <w:t>Единых способов деления</w:t>
-      </w:r>
-      <w:proofErr w:type="gramEnd"/>
-      <w:r>
-        <w:rPr>
-          <w:rFonts w:ascii="Times New Roman" w:eastAsia="Times New Roman" w:hAnsi="Times New Roman" w:cs="Times New Roman"/>
-          <w:color w:val="111111"/>
-          <w:sz w:val="28"/>
-          <w:szCs w:val="28"/>
-          <w:lang w:val="ru-RU"/>
-        </w:rPr>
-        <w:t xml:space="preserve"> полученных методом сварки элементов на категории не существует. Однако можно классифицировать конструкции по технологии формирования, назначению, рабочим качествам.</w:t>
+      <w:r>
+        <w:rPr>
+          <w:rFonts w:ascii="Times New Roman" w:eastAsia="Times New Roman" w:hAnsi="Times New Roman" w:cs="Times New Roman"/>
+          <w:color w:val="111111"/>
+          <w:sz w:val="28"/>
+          <w:szCs w:val="28"/>
+          <w:lang w:val="ru-RU"/>
+        </w:rPr>
+        <w:t>Единых способов деления полученных методом сварки элементов на категории не существует. Однако можно классифицировать конструкции по технологии формирования, назначению, рабочим качествам.</w:t>
       </w:r>
     </w:p>
     <w:p>
@@ -2777,29 +2763,7 @@
           <w:szCs w:val="28"/>
           <w:lang w:val="ru-RU"/>
         </w:rPr>
-        <w:t xml:space="preserve">Электротехнические стали. Применяются при создании </w:t>
-      </w:r>
-      <w:proofErr w:type="spellStart"/>
-      <w:r>
-        <w:rPr>
-          <w:rFonts w:ascii="Times New Roman" w:eastAsia="Times New Roman" w:hAnsi="Times New Roman" w:cs="Times New Roman"/>
-          <w:color w:val="111111"/>
-          <w:sz w:val="28"/>
-          <w:szCs w:val="28"/>
-          <w:lang w:val="ru-RU"/>
-        </w:rPr>
-        <w:t>магнитопроводов</w:t>
-      </w:r>
-      <w:proofErr w:type="spellEnd"/>
-      <w:r>
-        <w:rPr>
-          <w:rFonts w:ascii="Times New Roman" w:eastAsia="Times New Roman" w:hAnsi="Times New Roman" w:cs="Times New Roman"/>
-          <w:color w:val="111111"/>
-          <w:sz w:val="28"/>
-          <w:szCs w:val="28"/>
-          <w:lang w:val="ru-RU"/>
-        </w:rPr>
-        <w:t xml:space="preserve"> разного назначения.</w:t>
+        <w:t>Электротехнические стали. Применяются при создании магнитопроводов разного назначения.</w:t>
       </w:r>
     </w:p>
     <w:p>
@@ -3328,121 +3292,8 @@
           <w:sz w:val="28"/>
           <w:szCs w:val="28"/>
         </w:rPr>
-        <w:lastRenderedPageBreak/>
         <w:t>                               </w:t>
       </w:r>
-      <w:r>
-        <w:rPr>
-          <w:rFonts w:ascii="Times New Roman" w:eastAsia="Times New Roman" w:hAnsi="Times New Roman" w:cs="Times New Roman"/>
-          <w:noProof/>
-          <w:color w:val="000000"/>
-          <w:sz w:val="28"/>
-          <w:szCs w:val="28"/>
-          <w:bdr w:val="single" w:sz="2" w:space="0" w:color="000000" w:frame="1"/>
-        </w:rPr>
-        <w:drawing>
-          <wp:inline distT="0" distB="0" distL="0" distR="0" wp14:anchorId="7CDC16C7" wp14:editId="238FECDD">
-            <wp:extent cx="2461260" cy="1845945"/>
-            <wp:effectExtent l="0" t="0" r="0" b="1905"/>
-            <wp:docPr id="1" name="Рисунок 1" descr="Стыковые соединения."/>
-            <wp:cNvGraphicFramePr>
-              <a:graphicFrameLocks xmlns:a="http://schemas.openxmlformats.org/drawingml/2006/main" noChangeAspect="1"/>
-            </wp:cNvGraphicFramePr>
-            <a:graphic xmlns:a="http://schemas.openxmlformats.org/drawingml/2006/main">
-              <a:graphicData uri="http://schemas.openxmlformats.org/drawingml/2006/picture">
-                <pic:pic xmlns:pic="http://schemas.openxmlformats.org/drawingml/2006/picture">
-                  <pic:nvPicPr>
-                    <pic:cNvPr id="0" name="Picture 1" descr="Стыковые соединения."/>
-                    <pic:cNvPicPr>
-                      <a:picLocks noChangeAspect="1" noChangeArrowheads="1"/>
-                    </pic:cNvPicPr>
-                  </pic:nvPicPr>
-                  <pic:blipFill>
-                    <a:blip r:embed="rId5">
-                      <a:extLst>
-                        <a:ext uri="{28A0092B-C50C-407E-A947-70E740481C1C}">
-                          <a14:useLocalDpi xmlns:a14="http://schemas.microsoft.com/office/drawing/2010/main" val="0"/>
-                        </a:ext>
-                      </a:extLst>
-                    </a:blip>
-                    <a:srcRect/>
-                    <a:stretch>
-                      <a:fillRect/>
-                    </a:stretch>
-                  </pic:blipFill>
-                  <pic:spPr bwMode="auto">
-                    <a:xfrm>
-                      <a:off x="0" y="0"/>
-                      <a:ext cx="2461260" cy="1845945"/>
-                    </a:xfrm>
-                    <a:prstGeom prst="rect">
-                      <a:avLst/>
-                    </a:prstGeom>
-                    <a:noFill/>
-                    <a:ln>
-                      <a:noFill/>
-                    </a:ln>
-                  </pic:spPr>
-                </pic:pic>
-              </a:graphicData>
-            </a:graphic>
-          </wp:inline>
-        </w:drawing>
-      </w:r>
-    </w:p>
-    <w:p>
-      <w:pPr>
-        <w:shd w:val="clear" w:color="auto" w:fill="FFFFFF"/>
-        <w:spacing w:after="0" w:line="240" w:lineRule="auto"/>
-        <w:ind w:left="-142" w:firstLine="142"/>
-        <w:jc w:val="both"/>
-        <w:rPr>
-          <w:rFonts w:ascii="Times New Roman" w:eastAsia="Times New Roman" w:hAnsi="Times New Roman" w:cs="Times New Roman"/>
-          <w:color w:val="000000"/>
-          <w:sz w:val="28"/>
-          <w:szCs w:val="28"/>
-        </w:rPr>
-      </w:pPr>
-      <w:r>
-        <w:rPr>
-          <w:rFonts w:ascii="Times New Roman" w:eastAsia="Times New Roman" w:hAnsi="Times New Roman" w:cs="Times New Roman"/>
-          <w:color w:val="111111"/>
-          <w:sz w:val="28"/>
-          <w:szCs w:val="28"/>
-        </w:rPr>
-        <w:t xml:space="preserve">                                               Рис.1 </w:t>
-      </w:r>
-      <w:proofErr w:type="spellStart"/>
-      <w:r>
-        <w:rPr>
-          <w:rFonts w:ascii="Times New Roman" w:eastAsia="Times New Roman" w:hAnsi="Times New Roman" w:cs="Times New Roman"/>
-          <w:color w:val="111111"/>
-          <w:sz w:val="28"/>
-          <w:szCs w:val="28"/>
-        </w:rPr>
-        <w:t>Стыковое</w:t>
-      </w:r>
-      <w:proofErr w:type="spellEnd"/>
-      <w:r>
-        <w:rPr>
-          <w:rFonts w:ascii="Times New Roman" w:eastAsia="Times New Roman" w:hAnsi="Times New Roman" w:cs="Times New Roman"/>
-          <w:color w:val="111111"/>
-          <w:sz w:val="28"/>
-          <w:szCs w:val="28"/>
-        </w:rPr>
-        <w:t xml:space="preserve"> </w:t>
-      </w:r>
-      <w:proofErr w:type="spellStart"/>
-      <w:r>
-        <w:rPr>
-          <w:rFonts w:ascii="Times New Roman" w:eastAsia="Times New Roman" w:hAnsi="Times New Roman" w:cs="Times New Roman"/>
-          <w:color w:val="111111"/>
-          <w:sz w:val="28"/>
-          <w:szCs w:val="28"/>
-        </w:rPr>
-        <w:t>соединение</w:t>
-      </w:r>
-      <w:proofErr w:type="spellEnd"/>
     </w:p>
     <w:p>
       <w:pPr>
@@ -3569,47 +3420,7 @@
           <w:sz w:val="28"/>
           <w:szCs w:val="28"/>
         </w:rPr>
-        <w:t xml:space="preserve"> </w:t>
-      </w:r>
-      <w:proofErr w:type="spellStart"/>
-      <w:r>
-        <w:rPr>
-          <w:rFonts w:ascii="Times New Roman" w:eastAsia="Times New Roman" w:hAnsi="Times New Roman" w:cs="Times New Roman"/>
-          <w:color w:val="111111"/>
-          <w:sz w:val="28"/>
-          <w:szCs w:val="28"/>
-        </w:rPr>
-        <w:t>способы</w:t>
-      </w:r>
-      <w:proofErr w:type="spellEnd"/>
-      <w:r>
-        <w:rPr>
-          <w:rFonts w:ascii="Times New Roman" w:eastAsia="Times New Roman" w:hAnsi="Times New Roman" w:cs="Times New Roman"/>
-          <w:color w:val="111111"/>
-          <w:sz w:val="28"/>
-          <w:szCs w:val="28"/>
-        </w:rPr>
-        <w:t xml:space="preserve"> </w:t>
-      </w:r>
-      <w:proofErr w:type="spellStart"/>
-      <w:r>
-        <w:rPr>
-          <w:rFonts w:ascii="Times New Roman" w:eastAsia="Times New Roman" w:hAnsi="Times New Roman" w:cs="Times New Roman"/>
-          <w:color w:val="111111"/>
-          <w:sz w:val="28"/>
-          <w:szCs w:val="28"/>
-        </w:rPr>
-        <w:t>сварки</w:t>
-      </w:r>
-      <w:proofErr w:type="spellEnd"/>
-      <w:r>
-        <w:rPr>
-          <w:rFonts w:ascii="Times New Roman" w:eastAsia="Times New Roman" w:hAnsi="Times New Roman" w:cs="Times New Roman"/>
-          <w:color w:val="111111"/>
-          <w:sz w:val="28"/>
-          <w:szCs w:val="28"/>
-        </w:rPr>
-        <w:t>.</w:t>
+        <w:t xml:space="preserve"> способы сварки.</w:t>
       </w:r>
     </w:p>
     <w:p>
@@ -3623,79 +3434,439 @@
           <w:color w:val="000000"/>
           <w:sz w:val="28"/>
           <w:szCs w:val="28"/>
-        </w:rPr>
-      </w:pPr>
-      <w:r>
-        <w:rPr>
-          <w:rFonts w:ascii="Times New Roman" w:eastAsia="Times New Roman" w:hAnsi="Times New Roman" w:cs="Times New Roman"/>
-          <w:color w:val="111111"/>
-          <w:sz w:val="28"/>
-          <w:szCs w:val="28"/>
-        </w:rPr>
-        <w:t>                                             </w:t>
-      </w:r>
-      <w:r>
-        <w:rPr>
-          <w:rFonts w:ascii="Times New Roman" w:eastAsia="Times New Roman" w:hAnsi="Times New Roman" w:cs="Times New Roman"/>
-          <w:noProof/>
-          <w:color w:val="000000"/>
-          <w:sz w:val="28"/>
-          <w:szCs w:val="28"/>
-          <w:bdr w:val="single" w:sz="2" w:space="0" w:color="000000" w:frame="1"/>
-        </w:rPr>
-        <w:drawing>
-          <wp:inline distT="0" distB="0" distL="0" distR="0" wp14:anchorId="608EBDE0" wp14:editId="5F1719E8">
-            <wp:extent cx="2011680" cy="1529715"/>
-            <wp:effectExtent l="19050" t="19050" r="26670" b="13335"/>
-            <wp:docPr id="2" name="Рисунок 2" descr="Угловое соединение."/>
-            <wp:cNvGraphicFramePr>
-              <a:graphicFrameLocks xmlns:a="http://schemas.openxmlformats.org/drawingml/2006/main" noChangeAspect="1"/>
-            </wp:cNvGraphicFramePr>
-            <a:graphic xmlns:a="http://schemas.openxmlformats.org/drawingml/2006/main">
-              <a:graphicData uri="http://schemas.openxmlformats.org/drawingml/2006/picture">
-                <pic:pic xmlns:pic="http://schemas.openxmlformats.org/drawingml/2006/picture">
-                  <pic:nvPicPr>
-                    <pic:cNvPr id="0" name="Picture 2" descr="Угловое соединение."/>
-                    <pic:cNvPicPr>
-                      <a:picLocks noChangeAspect="1" noChangeArrowheads="1"/>
-                    </pic:cNvPicPr>
-                  </pic:nvPicPr>
-                  <pic:blipFill rotWithShape="1">
-                    <a:blip r:embed="rId6">
-                      <a:extLst>
-                        <a:ext uri="{28A0092B-C50C-407E-A947-70E740481C1C}">
-                          <a14:useLocalDpi xmlns:a14="http://schemas.microsoft.com/office/drawing/2010/main" val="0"/>
-                        </a:ext>
-                      </a:extLst>
-                    </a:blip>
-                    <a:srcRect l="4693" t="3369"/>
-                    <a:stretch/>
-                  </pic:blipFill>
-                  <pic:spPr bwMode="auto">
-                    <a:xfrm>
-                      <a:off x="0" y="0"/>
-                      <a:ext cx="2011680" cy="1529715"/>
-                    </a:xfrm>
-                    <a:prstGeom prst="rect">
-                      <a:avLst/>
-                    </a:prstGeom>
-                    <a:noFill/>
-                    <a:ln>
-                      <a:solidFill>
-                        <a:schemeClr val="bg1"/>
-                      </a:solidFill>
-                    </a:ln>
-                    <a:extLst>
-                      <a:ext uri="{53640926-AAD7-44D8-BBD7-CCE9431645EC}">
-                        <a14:shadowObscured xmlns:a14="http://schemas.microsoft.com/office/drawing/2010/main"/>
-                      </a:ext>
-                    </a:extLst>
-                  </pic:spPr>
-                </pic:pic>
-              </a:graphicData>
-            </a:graphic>
-          </wp:inline>
-        </w:drawing>
+          <w:lang w:val="ru-RU"/>
+        </w:rPr>
+      </w:pPr>
+      <w:r>
+        <w:rPr>
+          <w:rFonts w:ascii="Times New Roman" w:eastAsia="Times New Roman" w:hAnsi="Times New Roman" w:cs="Times New Roman"/>
+          <w:color w:val="111111"/>
+          <w:sz w:val="28"/>
+          <w:szCs w:val="28"/>
+        </w:rPr>
+        <w:lastRenderedPageBreak/>
+        <w:t> </w:t>
+      </w:r>
+      <w:r>
+        <w:rPr>
+          <w:rFonts w:ascii="Times New Roman" w:eastAsia="Times New Roman" w:hAnsi="Times New Roman" w:cs="Times New Roman"/>
+          <w:color w:val="111111"/>
+          <w:sz w:val="28"/>
+          <w:szCs w:val="28"/>
+          <w:lang w:val="ru-RU"/>
+        </w:rPr>
+        <w:t xml:space="preserve"> </w:t>
+      </w:r>
+      <w:r>
+        <w:rPr>
+          <w:rFonts w:ascii="Times New Roman" w:eastAsia="Times New Roman" w:hAnsi="Times New Roman" w:cs="Times New Roman"/>
+          <w:color w:val="111111"/>
+          <w:sz w:val="28"/>
+          <w:szCs w:val="28"/>
+        </w:rPr>
+        <w:t> </w:t>
+      </w:r>
+      <w:r>
+        <w:rPr>
+          <w:rFonts w:ascii="Times New Roman" w:eastAsia="Times New Roman" w:hAnsi="Times New Roman" w:cs="Times New Roman"/>
+          <w:color w:val="111111"/>
+          <w:sz w:val="28"/>
+          <w:szCs w:val="28"/>
+          <w:lang w:val="ru-RU"/>
+        </w:rPr>
+        <w:t xml:space="preserve"> </w:t>
+      </w:r>
+      <w:r>
+        <w:rPr>
+          <w:rFonts w:ascii="Times New Roman" w:eastAsia="Times New Roman" w:hAnsi="Times New Roman" w:cs="Times New Roman"/>
+          <w:color w:val="111111"/>
+          <w:sz w:val="28"/>
+          <w:szCs w:val="28"/>
+        </w:rPr>
+        <w:t> </w:t>
+      </w:r>
+      <w:r>
+        <w:rPr>
+          <w:rFonts w:ascii="Times New Roman" w:eastAsia="Times New Roman" w:hAnsi="Times New Roman" w:cs="Times New Roman"/>
+          <w:color w:val="111111"/>
+          <w:sz w:val="28"/>
+          <w:szCs w:val="28"/>
+          <w:lang w:val="ru-RU"/>
+        </w:rPr>
+        <w:t xml:space="preserve"> </w:t>
+      </w:r>
+      <w:r>
+        <w:rPr>
+          <w:rFonts w:ascii="Times New Roman" w:eastAsia="Times New Roman" w:hAnsi="Times New Roman" w:cs="Times New Roman"/>
+          <w:color w:val="111111"/>
+          <w:sz w:val="28"/>
+          <w:szCs w:val="28"/>
+        </w:rPr>
+        <w:t> </w:t>
+      </w:r>
+      <w:r>
+        <w:rPr>
+          <w:rFonts w:ascii="Times New Roman" w:eastAsia="Times New Roman" w:hAnsi="Times New Roman" w:cs="Times New Roman"/>
+          <w:color w:val="111111"/>
+          <w:sz w:val="28"/>
+          <w:szCs w:val="28"/>
+          <w:lang w:val="ru-RU"/>
+        </w:rPr>
+        <w:t xml:space="preserve"> </w:t>
+      </w:r>
+      <w:r>
+        <w:rPr>
+          <w:rFonts w:ascii="Times New Roman" w:eastAsia="Times New Roman" w:hAnsi="Times New Roman" w:cs="Times New Roman"/>
+          <w:color w:val="111111"/>
+          <w:sz w:val="28"/>
+          <w:szCs w:val="28"/>
+        </w:rPr>
+        <w:t> </w:t>
+      </w:r>
+      <w:r>
+        <w:rPr>
+          <w:rFonts w:ascii="Times New Roman" w:eastAsia="Times New Roman" w:hAnsi="Times New Roman" w:cs="Times New Roman"/>
+          <w:color w:val="111111"/>
+          <w:sz w:val="28"/>
+          <w:szCs w:val="28"/>
+          <w:lang w:val="ru-RU"/>
+        </w:rPr>
+        <w:t xml:space="preserve"> </w:t>
+      </w:r>
+      <w:r>
+        <w:rPr>
+          <w:rFonts w:ascii="Times New Roman" w:eastAsia="Times New Roman" w:hAnsi="Times New Roman" w:cs="Times New Roman"/>
+          <w:color w:val="111111"/>
+          <w:sz w:val="28"/>
+          <w:szCs w:val="28"/>
+        </w:rPr>
+        <w:t> </w:t>
+      </w:r>
+      <w:r>
+        <w:rPr>
+          <w:rFonts w:ascii="Times New Roman" w:eastAsia="Times New Roman" w:hAnsi="Times New Roman" w:cs="Times New Roman"/>
+          <w:color w:val="111111"/>
+          <w:sz w:val="28"/>
+          <w:szCs w:val="28"/>
+          <w:lang w:val="ru-RU"/>
+        </w:rPr>
+        <w:t xml:space="preserve"> </w:t>
+      </w:r>
+      <w:r>
+        <w:rPr>
+          <w:rFonts w:ascii="Times New Roman" w:eastAsia="Times New Roman" w:hAnsi="Times New Roman" w:cs="Times New Roman"/>
+          <w:color w:val="111111"/>
+          <w:sz w:val="28"/>
+          <w:szCs w:val="28"/>
+        </w:rPr>
+        <w:t> </w:t>
+      </w:r>
+      <w:r>
+        <w:rPr>
+          <w:rFonts w:ascii="Times New Roman" w:eastAsia="Times New Roman" w:hAnsi="Times New Roman" w:cs="Times New Roman"/>
+          <w:color w:val="111111"/>
+          <w:sz w:val="28"/>
+          <w:szCs w:val="28"/>
+          <w:lang w:val="ru-RU"/>
+        </w:rPr>
+        <w:t xml:space="preserve"> </w:t>
+      </w:r>
+      <w:r>
+        <w:rPr>
+          <w:rFonts w:ascii="Times New Roman" w:eastAsia="Times New Roman" w:hAnsi="Times New Roman" w:cs="Times New Roman"/>
+          <w:color w:val="111111"/>
+          <w:sz w:val="28"/>
+          <w:szCs w:val="28"/>
+        </w:rPr>
+        <w:t> </w:t>
+      </w:r>
+      <w:r>
+        <w:rPr>
+          <w:rFonts w:ascii="Times New Roman" w:eastAsia="Times New Roman" w:hAnsi="Times New Roman" w:cs="Times New Roman"/>
+          <w:color w:val="111111"/>
+          <w:sz w:val="28"/>
+          <w:szCs w:val="28"/>
+          <w:lang w:val="ru-RU"/>
+        </w:rPr>
+        <w:t xml:space="preserve"> </w:t>
+      </w:r>
+      <w:r>
+        <w:rPr>
+          <w:rFonts w:ascii="Times New Roman" w:eastAsia="Times New Roman" w:hAnsi="Times New Roman" w:cs="Times New Roman"/>
+          <w:color w:val="111111"/>
+          <w:sz w:val="28"/>
+          <w:szCs w:val="28"/>
+        </w:rPr>
+        <w:t> </w:t>
+      </w:r>
+      <w:r>
+        <w:rPr>
+          <w:rFonts w:ascii="Times New Roman" w:eastAsia="Times New Roman" w:hAnsi="Times New Roman" w:cs="Times New Roman"/>
+          <w:color w:val="111111"/>
+          <w:sz w:val="28"/>
+          <w:szCs w:val="28"/>
+          <w:lang w:val="ru-RU"/>
+        </w:rPr>
+        <w:t xml:space="preserve"> </w:t>
+      </w:r>
+      <w:r>
+        <w:rPr>
+          <w:rFonts w:ascii="Times New Roman" w:eastAsia="Times New Roman" w:hAnsi="Times New Roman" w:cs="Times New Roman"/>
+          <w:color w:val="111111"/>
+          <w:sz w:val="28"/>
+          <w:szCs w:val="28"/>
+        </w:rPr>
+        <w:t> </w:t>
+      </w:r>
+      <w:r>
+        <w:rPr>
+          <w:rFonts w:ascii="Times New Roman" w:eastAsia="Times New Roman" w:hAnsi="Times New Roman" w:cs="Times New Roman"/>
+          <w:color w:val="111111"/>
+          <w:sz w:val="28"/>
+          <w:szCs w:val="28"/>
+          <w:lang w:val="ru-RU"/>
+        </w:rPr>
+        <w:t xml:space="preserve"> </w:t>
+      </w:r>
+      <w:r>
+        <w:rPr>
+          <w:rFonts w:ascii="Times New Roman" w:eastAsia="Times New Roman" w:hAnsi="Times New Roman" w:cs="Times New Roman"/>
+          <w:color w:val="111111"/>
+          <w:sz w:val="28"/>
+          <w:szCs w:val="28"/>
+        </w:rPr>
+        <w:t> </w:t>
+      </w:r>
+      <w:r>
+        <w:rPr>
+          <w:rFonts w:ascii="Times New Roman" w:eastAsia="Times New Roman" w:hAnsi="Times New Roman" w:cs="Times New Roman"/>
+          <w:color w:val="111111"/>
+          <w:sz w:val="28"/>
+          <w:szCs w:val="28"/>
+          <w:lang w:val="ru-RU"/>
+        </w:rPr>
+        <w:t xml:space="preserve"> </w:t>
+      </w:r>
+      <w:r>
+        <w:rPr>
+          <w:rFonts w:ascii="Times New Roman" w:eastAsia="Times New Roman" w:hAnsi="Times New Roman" w:cs="Times New Roman"/>
+          <w:color w:val="111111"/>
+          <w:sz w:val="28"/>
+          <w:szCs w:val="28"/>
+        </w:rPr>
+        <w:t> </w:t>
+      </w:r>
+      <w:r>
+        <w:rPr>
+          <w:rFonts w:ascii="Times New Roman" w:eastAsia="Times New Roman" w:hAnsi="Times New Roman" w:cs="Times New Roman"/>
+          <w:color w:val="111111"/>
+          <w:sz w:val="28"/>
+          <w:szCs w:val="28"/>
+          <w:lang w:val="ru-RU"/>
+        </w:rPr>
+        <w:t xml:space="preserve"> </w:t>
+      </w:r>
+      <w:r>
+        <w:rPr>
+          <w:rFonts w:ascii="Times New Roman" w:eastAsia="Times New Roman" w:hAnsi="Times New Roman" w:cs="Times New Roman"/>
+          <w:color w:val="111111"/>
+          <w:sz w:val="28"/>
+          <w:szCs w:val="28"/>
+        </w:rPr>
+        <w:t> </w:t>
+      </w:r>
+      <w:r>
+        <w:rPr>
+          <w:rFonts w:ascii="Times New Roman" w:eastAsia="Times New Roman" w:hAnsi="Times New Roman" w:cs="Times New Roman"/>
+          <w:color w:val="111111"/>
+          <w:sz w:val="28"/>
+          <w:szCs w:val="28"/>
+          <w:lang w:val="ru-RU"/>
+        </w:rPr>
+        <w:t xml:space="preserve"> </w:t>
+      </w:r>
+      <w:r>
+        <w:rPr>
+          <w:rFonts w:ascii="Times New Roman" w:eastAsia="Times New Roman" w:hAnsi="Times New Roman" w:cs="Times New Roman"/>
+          <w:color w:val="111111"/>
+          <w:sz w:val="28"/>
+          <w:szCs w:val="28"/>
+        </w:rPr>
+        <w:t> </w:t>
+      </w:r>
+      <w:r>
+        <w:rPr>
+          <w:rFonts w:ascii="Times New Roman" w:eastAsia="Times New Roman" w:hAnsi="Times New Roman" w:cs="Times New Roman"/>
+          <w:color w:val="111111"/>
+          <w:sz w:val="28"/>
+          <w:szCs w:val="28"/>
+          <w:lang w:val="ru-RU"/>
+        </w:rPr>
+        <w:t xml:space="preserve"> </w:t>
+      </w:r>
+      <w:r>
+        <w:rPr>
+          <w:rFonts w:ascii="Times New Roman" w:eastAsia="Times New Roman" w:hAnsi="Times New Roman" w:cs="Times New Roman"/>
+          <w:color w:val="111111"/>
+          <w:sz w:val="28"/>
+          <w:szCs w:val="28"/>
+        </w:rPr>
+        <w:t> </w:t>
+      </w:r>
+      <w:r>
+        <w:rPr>
+          <w:rFonts w:ascii="Times New Roman" w:eastAsia="Times New Roman" w:hAnsi="Times New Roman" w:cs="Times New Roman"/>
+          <w:color w:val="111111"/>
+          <w:sz w:val="28"/>
+          <w:szCs w:val="28"/>
+          <w:lang w:val="ru-RU"/>
+        </w:rPr>
+        <w:t xml:space="preserve"> </w:t>
+      </w:r>
+      <w:r>
+        <w:rPr>
+          <w:rFonts w:ascii="Times New Roman" w:eastAsia="Times New Roman" w:hAnsi="Times New Roman" w:cs="Times New Roman"/>
+          <w:color w:val="111111"/>
+          <w:sz w:val="28"/>
+          <w:szCs w:val="28"/>
+        </w:rPr>
+        <w:t> </w:t>
+      </w:r>
+      <w:r>
+        <w:rPr>
+          <w:rFonts w:ascii="Times New Roman" w:eastAsia="Times New Roman" w:hAnsi="Times New Roman" w:cs="Times New Roman"/>
+          <w:color w:val="111111"/>
+          <w:sz w:val="28"/>
+          <w:szCs w:val="28"/>
+          <w:lang w:val="ru-RU"/>
+        </w:rPr>
+        <w:t xml:space="preserve"> </w:t>
+      </w:r>
+      <w:r>
+        <w:rPr>
+          <w:rFonts w:ascii="Times New Roman" w:eastAsia="Times New Roman" w:hAnsi="Times New Roman" w:cs="Times New Roman"/>
+          <w:color w:val="111111"/>
+          <w:sz w:val="28"/>
+          <w:szCs w:val="28"/>
+        </w:rPr>
+        <w:t> </w:t>
+      </w:r>
+      <w:r>
+        <w:rPr>
+          <w:rFonts w:ascii="Times New Roman" w:eastAsia="Times New Roman" w:hAnsi="Times New Roman" w:cs="Times New Roman"/>
+          <w:color w:val="111111"/>
+          <w:sz w:val="28"/>
+          <w:szCs w:val="28"/>
+          <w:lang w:val="ru-RU"/>
+        </w:rPr>
+        <w:t xml:space="preserve"> </w:t>
+      </w:r>
+      <w:r>
+        <w:rPr>
+          <w:rFonts w:ascii="Times New Roman" w:eastAsia="Times New Roman" w:hAnsi="Times New Roman" w:cs="Times New Roman"/>
+          <w:color w:val="111111"/>
+          <w:sz w:val="28"/>
+          <w:szCs w:val="28"/>
+        </w:rPr>
+        <w:t> </w:t>
+      </w:r>
+      <w:r>
+        <w:rPr>
+          <w:rFonts w:ascii="Times New Roman" w:eastAsia="Times New Roman" w:hAnsi="Times New Roman" w:cs="Times New Roman"/>
+          <w:color w:val="111111"/>
+          <w:sz w:val="28"/>
+          <w:szCs w:val="28"/>
+          <w:lang w:val="ru-RU"/>
+        </w:rPr>
+        <w:t xml:space="preserve"> </w:t>
+      </w:r>
+      <w:r>
+        <w:rPr>
+          <w:rFonts w:ascii="Times New Roman" w:eastAsia="Times New Roman" w:hAnsi="Times New Roman" w:cs="Times New Roman"/>
+          <w:color w:val="111111"/>
+          <w:sz w:val="28"/>
+          <w:szCs w:val="28"/>
+        </w:rPr>
+        <w:t> </w:t>
+      </w:r>
+      <w:r>
+        <w:rPr>
+          <w:rFonts w:ascii="Times New Roman" w:eastAsia="Times New Roman" w:hAnsi="Times New Roman" w:cs="Times New Roman"/>
+          <w:color w:val="111111"/>
+          <w:sz w:val="28"/>
+          <w:szCs w:val="28"/>
+          <w:lang w:val="ru-RU"/>
+        </w:rPr>
+        <w:t xml:space="preserve"> </w:t>
+      </w:r>
+      <w:r>
+        <w:rPr>
+          <w:rFonts w:ascii="Times New Roman" w:eastAsia="Times New Roman" w:hAnsi="Times New Roman" w:cs="Times New Roman"/>
+          <w:color w:val="111111"/>
+          <w:sz w:val="28"/>
+          <w:szCs w:val="28"/>
+        </w:rPr>
+        <w:t> </w:t>
+      </w:r>
+      <w:r>
+        <w:rPr>
+          <w:rFonts w:ascii="Times New Roman" w:eastAsia="Times New Roman" w:hAnsi="Times New Roman" w:cs="Times New Roman"/>
+          <w:color w:val="111111"/>
+          <w:sz w:val="28"/>
+          <w:szCs w:val="28"/>
+          <w:lang w:val="ru-RU"/>
+        </w:rPr>
+        <w:t xml:space="preserve"> </w:t>
+      </w:r>
+      <w:r>
+        <w:rPr>
+          <w:rFonts w:ascii="Times New Roman" w:eastAsia="Times New Roman" w:hAnsi="Times New Roman" w:cs="Times New Roman"/>
+          <w:color w:val="111111"/>
+          <w:sz w:val="28"/>
+          <w:szCs w:val="28"/>
+        </w:rPr>
+        <w:t> </w:t>
+      </w:r>
+      <w:r>
+        <w:rPr>
+          <w:rFonts w:ascii="Times New Roman" w:eastAsia="Times New Roman" w:hAnsi="Times New Roman" w:cs="Times New Roman"/>
+          <w:color w:val="111111"/>
+          <w:sz w:val="28"/>
+          <w:szCs w:val="28"/>
+          <w:lang w:val="ru-RU"/>
+        </w:rPr>
+        <w:t xml:space="preserve"> </w:t>
+      </w:r>
+      <w:r>
+        <w:rPr>
+          <w:rFonts w:ascii="Times New Roman" w:eastAsia="Times New Roman" w:hAnsi="Times New Roman" w:cs="Times New Roman"/>
+          <w:color w:val="111111"/>
+          <w:sz w:val="28"/>
+          <w:szCs w:val="28"/>
+        </w:rPr>
+        <w:t>   </w:t>
+      </w:r>
+      <w:proofErr w:type="spellStart"/>
+      <w:r>
+        <w:rPr>
+          <w:rFonts w:ascii="Times New Roman" w:eastAsia="Times New Roman" w:hAnsi="Times New Roman" w:cs="Times New Roman"/>
+          <w:color w:val="111111"/>
+          <w:sz w:val="28"/>
+          <w:szCs w:val="28"/>
+          <w:lang w:val="ru-RU"/>
+        </w:rPr>
+        <w:t>Нахлесточные</w:t>
+      </w:r>
+      <w:proofErr w:type="spellEnd"/>
+      <w:r>
+        <w:rPr>
+          <w:rFonts w:ascii="Times New Roman" w:eastAsia="Times New Roman" w:hAnsi="Times New Roman" w:cs="Times New Roman"/>
+          <w:color w:val="111111"/>
+          <w:sz w:val="28"/>
+          <w:szCs w:val="28"/>
+          <w:lang w:val="ru-RU"/>
+        </w:rPr>
+        <w:t>, применяемые для соединения листовых элементов. От стыковых отличаются меньшей прочностью.</w:t>
       </w:r>
     </w:p>
     <w:p>
@@ -3718,528 +3889,359 @@
           <w:sz w:val="28"/>
           <w:szCs w:val="28"/>
         </w:rPr>
-        <w:t>                                                 Рис.</w:t>
-      </w:r>
-      <w:proofErr w:type="gramStart"/>
-      <w:r>
-        <w:rPr>
-          <w:rFonts w:ascii="Times New Roman" w:eastAsia="Times New Roman" w:hAnsi="Times New Roman" w:cs="Times New Roman"/>
-          <w:color w:val="111111"/>
-          <w:sz w:val="28"/>
-          <w:szCs w:val="28"/>
-        </w:rPr>
-        <w:t>2  </w:t>
-      </w:r>
-      <w:proofErr w:type="spellStart"/>
-      <w:r>
-        <w:rPr>
-          <w:rFonts w:ascii="Times New Roman" w:eastAsia="Times New Roman" w:hAnsi="Times New Roman" w:cs="Times New Roman"/>
-          <w:color w:val="111111"/>
-          <w:sz w:val="28"/>
-          <w:szCs w:val="28"/>
-        </w:rPr>
-        <w:t>Угловое</w:t>
-      </w:r>
-      <w:proofErr w:type="spellEnd"/>
-      <w:proofErr w:type="gramEnd"/>
-      <w:r>
-        <w:rPr>
-          <w:rFonts w:ascii="Times New Roman" w:eastAsia="Times New Roman" w:hAnsi="Times New Roman" w:cs="Times New Roman"/>
-          <w:color w:val="111111"/>
-          <w:sz w:val="28"/>
-          <w:szCs w:val="28"/>
-        </w:rPr>
-        <w:t xml:space="preserve"> </w:t>
-      </w:r>
-      <w:proofErr w:type="spellStart"/>
-      <w:r>
-        <w:rPr>
-          <w:rFonts w:ascii="Times New Roman" w:eastAsia="Times New Roman" w:hAnsi="Times New Roman" w:cs="Times New Roman"/>
-          <w:color w:val="111111"/>
-          <w:sz w:val="28"/>
-          <w:szCs w:val="28"/>
-        </w:rPr>
-        <w:t>соединение</w:t>
-      </w:r>
-      <w:proofErr w:type="spellEnd"/>
-    </w:p>
-    <w:p>
-      <w:pPr>
-        <w:numPr>
-          <w:ilvl w:val="0"/>
-          <w:numId w:val="8"/>
-        </w:numPr>
-        <w:shd w:val="clear" w:color="auto" w:fill="FFFFFF"/>
-        <w:spacing w:before="100" w:beforeAutospacing="1" w:after="100" w:afterAutospacing="1" w:line="240" w:lineRule="auto"/>
-        <w:ind w:left="-142" w:firstLine="142"/>
-        <w:jc w:val="both"/>
-        <w:rPr>
-          <w:rFonts w:ascii="Times New Roman" w:eastAsia="Times New Roman" w:hAnsi="Times New Roman" w:cs="Times New Roman"/>
-          <w:color w:val="000000"/>
-          <w:sz w:val="28"/>
-          <w:szCs w:val="28"/>
-          <w:lang w:val="ru-RU"/>
-        </w:rPr>
-      </w:pPr>
-      <w:proofErr w:type="spellStart"/>
-      <w:r>
-        <w:rPr>
-          <w:rFonts w:ascii="Times New Roman" w:eastAsia="Times New Roman" w:hAnsi="Times New Roman" w:cs="Times New Roman"/>
-          <w:color w:val="111111"/>
-          <w:sz w:val="28"/>
-          <w:szCs w:val="28"/>
-          <w:lang w:val="ru-RU"/>
-        </w:rPr>
-        <w:t>Нахлесточные</w:t>
-      </w:r>
-      <w:proofErr w:type="spellEnd"/>
-      <w:r>
-        <w:rPr>
-          <w:rFonts w:ascii="Times New Roman" w:eastAsia="Times New Roman" w:hAnsi="Times New Roman" w:cs="Times New Roman"/>
-          <w:color w:val="111111"/>
-          <w:sz w:val="28"/>
-          <w:szCs w:val="28"/>
-          <w:lang w:val="ru-RU"/>
-        </w:rPr>
-        <w:t>, применяемые для соединения листовых элементов. От стыковых отличаются меньшей прочностью.</w:t>
-      </w:r>
-    </w:p>
-    <w:p>
-      <w:pPr>
-        <w:shd w:val="clear" w:color="auto" w:fill="FFFFFF"/>
-        <w:spacing w:after="0" w:line="240" w:lineRule="auto"/>
-        <w:ind w:left="-142" w:firstLine="142"/>
-        <w:jc w:val="both"/>
-        <w:rPr>
-          <w:rFonts w:ascii="Times New Roman" w:eastAsia="Times New Roman" w:hAnsi="Times New Roman" w:cs="Times New Roman"/>
-          <w:color w:val="000000"/>
-          <w:sz w:val="28"/>
-          <w:szCs w:val="28"/>
-        </w:rPr>
-      </w:pPr>
-      <w:r>
-        <w:rPr>
-          <w:rFonts w:ascii="Times New Roman" w:eastAsia="Times New Roman" w:hAnsi="Times New Roman" w:cs="Times New Roman"/>
-          <w:color w:val="111111"/>
-          <w:sz w:val="28"/>
-          <w:szCs w:val="28"/>
-        </w:rPr>
-        <w:t> </w:t>
-      </w:r>
-      <w:r>
-        <w:rPr>
-          <w:rFonts w:ascii="Times New Roman" w:eastAsia="Times New Roman" w:hAnsi="Times New Roman" w:cs="Times New Roman"/>
-          <w:color w:val="111111"/>
-          <w:sz w:val="28"/>
-          <w:szCs w:val="28"/>
-          <w:lang w:val="ru-RU"/>
-        </w:rPr>
-        <w:t xml:space="preserve"> </w:t>
-      </w:r>
-      <w:r>
-        <w:rPr>
-          <w:rFonts w:ascii="Times New Roman" w:eastAsia="Times New Roman" w:hAnsi="Times New Roman" w:cs="Times New Roman"/>
-          <w:color w:val="111111"/>
-          <w:sz w:val="28"/>
-          <w:szCs w:val="28"/>
-        </w:rPr>
-        <w:t> </w:t>
-      </w:r>
-      <w:r>
-        <w:rPr>
-          <w:rFonts w:ascii="Times New Roman" w:eastAsia="Times New Roman" w:hAnsi="Times New Roman" w:cs="Times New Roman"/>
-          <w:color w:val="111111"/>
-          <w:sz w:val="28"/>
-          <w:szCs w:val="28"/>
-          <w:lang w:val="ru-RU"/>
-        </w:rPr>
-        <w:t xml:space="preserve"> </w:t>
-      </w:r>
-      <w:r>
-        <w:rPr>
-          <w:rFonts w:ascii="Times New Roman" w:eastAsia="Times New Roman" w:hAnsi="Times New Roman" w:cs="Times New Roman"/>
-          <w:color w:val="111111"/>
-          <w:sz w:val="28"/>
-          <w:szCs w:val="28"/>
-        </w:rPr>
-        <w:t> </w:t>
-      </w:r>
-      <w:r>
-        <w:rPr>
-          <w:rFonts w:ascii="Times New Roman" w:eastAsia="Times New Roman" w:hAnsi="Times New Roman" w:cs="Times New Roman"/>
-          <w:color w:val="111111"/>
-          <w:sz w:val="28"/>
-          <w:szCs w:val="28"/>
-          <w:lang w:val="ru-RU"/>
-        </w:rPr>
-        <w:t xml:space="preserve"> </w:t>
-      </w:r>
-      <w:r>
-        <w:rPr>
-          <w:rFonts w:ascii="Times New Roman" w:eastAsia="Times New Roman" w:hAnsi="Times New Roman" w:cs="Times New Roman"/>
-          <w:color w:val="111111"/>
-          <w:sz w:val="28"/>
-          <w:szCs w:val="28"/>
-        </w:rPr>
-        <w:t> </w:t>
-      </w:r>
-      <w:r>
-        <w:rPr>
-          <w:rFonts w:ascii="Times New Roman" w:eastAsia="Times New Roman" w:hAnsi="Times New Roman" w:cs="Times New Roman"/>
-          <w:color w:val="111111"/>
-          <w:sz w:val="28"/>
-          <w:szCs w:val="28"/>
-          <w:lang w:val="ru-RU"/>
-        </w:rPr>
-        <w:t xml:space="preserve"> </w:t>
-      </w:r>
-      <w:r>
-        <w:rPr>
-          <w:rFonts w:ascii="Times New Roman" w:eastAsia="Times New Roman" w:hAnsi="Times New Roman" w:cs="Times New Roman"/>
-          <w:color w:val="111111"/>
-          <w:sz w:val="28"/>
-          <w:szCs w:val="28"/>
-        </w:rPr>
-        <w:t> </w:t>
-      </w:r>
-      <w:r>
-        <w:rPr>
-          <w:rFonts w:ascii="Times New Roman" w:eastAsia="Times New Roman" w:hAnsi="Times New Roman" w:cs="Times New Roman"/>
-          <w:color w:val="111111"/>
-          <w:sz w:val="28"/>
-          <w:szCs w:val="28"/>
-          <w:lang w:val="ru-RU"/>
-        </w:rPr>
-        <w:t xml:space="preserve"> </w:t>
-      </w:r>
-      <w:r>
-        <w:rPr>
-          <w:rFonts w:ascii="Times New Roman" w:eastAsia="Times New Roman" w:hAnsi="Times New Roman" w:cs="Times New Roman"/>
-          <w:color w:val="111111"/>
-          <w:sz w:val="28"/>
-          <w:szCs w:val="28"/>
-        </w:rPr>
-        <w:t> </w:t>
-      </w:r>
-      <w:r>
-        <w:rPr>
-          <w:rFonts w:ascii="Times New Roman" w:eastAsia="Times New Roman" w:hAnsi="Times New Roman" w:cs="Times New Roman"/>
-          <w:color w:val="111111"/>
-          <w:sz w:val="28"/>
-          <w:szCs w:val="28"/>
-          <w:lang w:val="ru-RU"/>
-        </w:rPr>
-        <w:t xml:space="preserve"> </w:t>
-      </w:r>
-      <w:r>
-        <w:rPr>
-          <w:rFonts w:ascii="Times New Roman" w:eastAsia="Times New Roman" w:hAnsi="Times New Roman" w:cs="Times New Roman"/>
-          <w:color w:val="111111"/>
-          <w:sz w:val="28"/>
-          <w:szCs w:val="28"/>
-        </w:rPr>
-        <w:t> </w:t>
-      </w:r>
-      <w:r>
-        <w:rPr>
-          <w:rFonts w:ascii="Times New Roman" w:eastAsia="Times New Roman" w:hAnsi="Times New Roman" w:cs="Times New Roman"/>
-          <w:color w:val="111111"/>
-          <w:sz w:val="28"/>
-          <w:szCs w:val="28"/>
-          <w:lang w:val="ru-RU"/>
-        </w:rPr>
-        <w:t xml:space="preserve"> </w:t>
-      </w:r>
-      <w:r>
-        <w:rPr>
-          <w:rFonts w:ascii="Times New Roman" w:eastAsia="Times New Roman" w:hAnsi="Times New Roman" w:cs="Times New Roman"/>
-          <w:color w:val="111111"/>
-          <w:sz w:val="28"/>
-          <w:szCs w:val="28"/>
-        </w:rPr>
-        <w:t> </w:t>
-      </w:r>
-      <w:r>
-        <w:rPr>
-          <w:rFonts w:ascii="Times New Roman" w:eastAsia="Times New Roman" w:hAnsi="Times New Roman" w:cs="Times New Roman"/>
-          <w:color w:val="111111"/>
-          <w:sz w:val="28"/>
-          <w:szCs w:val="28"/>
-          <w:lang w:val="ru-RU"/>
-        </w:rPr>
-        <w:t xml:space="preserve"> </w:t>
-      </w:r>
-      <w:r>
-        <w:rPr>
-          <w:rFonts w:ascii="Times New Roman" w:eastAsia="Times New Roman" w:hAnsi="Times New Roman" w:cs="Times New Roman"/>
-          <w:color w:val="111111"/>
-          <w:sz w:val="28"/>
-          <w:szCs w:val="28"/>
-        </w:rPr>
-        <w:t> </w:t>
-      </w:r>
-      <w:r>
-        <w:rPr>
-          <w:rFonts w:ascii="Times New Roman" w:eastAsia="Times New Roman" w:hAnsi="Times New Roman" w:cs="Times New Roman"/>
-          <w:color w:val="111111"/>
-          <w:sz w:val="28"/>
-          <w:szCs w:val="28"/>
-          <w:lang w:val="ru-RU"/>
-        </w:rPr>
-        <w:t xml:space="preserve"> </w:t>
-      </w:r>
-      <w:r>
-        <w:rPr>
-          <w:rFonts w:ascii="Times New Roman" w:eastAsia="Times New Roman" w:hAnsi="Times New Roman" w:cs="Times New Roman"/>
-          <w:color w:val="111111"/>
-          <w:sz w:val="28"/>
-          <w:szCs w:val="28"/>
-        </w:rPr>
-        <w:t> </w:t>
-      </w:r>
-      <w:r>
-        <w:rPr>
-          <w:rFonts w:ascii="Times New Roman" w:eastAsia="Times New Roman" w:hAnsi="Times New Roman" w:cs="Times New Roman"/>
-          <w:color w:val="111111"/>
-          <w:sz w:val="28"/>
-          <w:szCs w:val="28"/>
-          <w:lang w:val="ru-RU"/>
-        </w:rPr>
-        <w:t xml:space="preserve"> </w:t>
-      </w:r>
-      <w:r>
-        <w:rPr>
-          <w:rFonts w:ascii="Times New Roman" w:eastAsia="Times New Roman" w:hAnsi="Times New Roman" w:cs="Times New Roman"/>
-          <w:color w:val="111111"/>
-          <w:sz w:val="28"/>
-          <w:szCs w:val="28"/>
-        </w:rPr>
-        <w:t> </w:t>
-      </w:r>
-      <w:r>
-        <w:rPr>
-          <w:rFonts w:ascii="Times New Roman" w:eastAsia="Times New Roman" w:hAnsi="Times New Roman" w:cs="Times New Roman"/>
-          <w:color w:val="111111"/>
-          <w:sz w:val="28"/>
-          <w:szCs w:val="28"/>
-          <w:lang w:val="ru-RU"/>
-        </w:rPr>
-        <w:t xml:space="preserve"> </w:t>
-      </w:r>
-      <w:r>
-        <w:rPr>
-          <w:rFonts w:ascii="Times New Roman" w:eastAsia="Times New Roman" w:hAnsi="Times New Roman" w:cs="Times New Roman"/>
-          <w:color w:val="111111"/>
-          <w:sz w:val="28"/>
-          <w:szCs w:val="28"/>
-        </w:rPr>
-        <w:t> </w:t>
-      </w:r>
-      <w:r>
-        <w:rPr>
-          <w:rFonts w:ascii="Times New Roman" w:eastAsia="Times New Roman" w:hAnsi="Times New Roman" w:cs="Times New Roman"/>
-          <w:color w:val="111111"/>
-          <w:sz w:val="28"/>
-          <w:szCs w:val="28"/>
-          <w:lang w:val="ru-RU"/>
-        </w:rPr>
-        <w:t xml:space="preserve"> </w:t>
-      </w:r>
-      <w:r>
-        <w:rPr>
-          <w:rFonts w:ascii="Times New Roman" w:eastAsia="Times New Roman" w:hAnsi="Times New Roman" w:cs="Times New Roman"/>
-          <w:color w:val="111111"/>
-          <w:sz w:val="28"/>
-          <w:szCs w:val="28"/>
-        </w:rPr>
-        <w:t> </w:t>
-      </w:r>
-      <w:r>
-        <w:rPr>
-          <w:rFonts w:ascii="Times New Roman" w:eastAsia="Times New Roman" w:hAnsi="Times New Roman" w:cs="Times New Roman"/>
-          <w:color w:val="111111"/>
-          <w:sz w:val="28"/>
-          <w:szCs w:val="28"/>
-          <w:lang w:val="ru-RU"/>
-        </w:rPr>
-        <w:t xml:space="preserve"> </w:t>
-      </w:r>
-      <w:r>
-        <w:rPr>
-          <w:rFonts w:ascii="Times New Roman" w:eastAsia="Times New Roman" w:hAnsi="Times New Roman" w:cs="Times New Roman"/>
-          <w:color w:val="111111"/>
-          <w:sz w:val="28"/>
-          <w:szCs w:val="28"/>
-        </w:rPr>
-        <w:t> </w:t>
-      </w:r>
-      <w:r>
-        <w:rPr>
-          <w:rFonts w:ascii="Times New Roman" w:eastAsia="Times New Roman" w:hAnsi="Times New Roman" w:cs="Times New Roman"/>
-          <w:color w:val="111111"/>
-          <w:sz w:val="28"/>
-          <w:szCs w:val="28"/>
-          <w:lang w:val="ru-RU"/>
-        </w:rPr>
-        <w:t xml:space="preserve"> </w:t>
-      </w:r>
-      <w:r>
-        <w:rPr>
-          <w:rFonts w:ascii="Times New Roman" w:eastAsia="Times New Roman" w:hAnsi="Times New Roman" w:cs="Times New Roman"/>
-          <w:color w:val="111111"/>
-          <w:sz w:val="28"/>
-          <w:szCs w:val="28"/>
-        </w:rPr>
-        <w:t> </w:t>
-      </w:r>
-      <w:r>
-        <w:rPr>
-          <w:rFonts w:ascii="Times New Roman" w:eastAsia="Times New Roman" w:hAnsi="Times New Roman" w:cs="Times New Roman"/>
-          <w:color w:val="111111"/>
-          <w:sz w:val="28"/>
-          <w:szCs w:val="28"/>
-          <w:lang w:val="ru-RU"/>
-        </w:rPr>
-        <w:t xml:space="preserve"> </w:t>
-      </w:r>
-      <w:r>
-        <w:rPr>
-          <w:rFonts w:ascii="Times New Roman" w:eastAsia="Times New Roman" w:hAnsi="Times New Roman" w:cs="Times New Roman"/>
-          <w:color w:val="111111"/>
-          <w:sz w:val="28"/>
-          <w:szCs w:val="28"/>
-        </w:rPr>
-        <w:t> </w:t>
-      </w:r>
-      <w:r>
-        <w:rPr>
-          <w:rFonts w:ascii="Times New Roman" w:eastAsia="Times New Roman" w:hAnsi="Times New Roman" w:cs="Times New Roman"/>
-          <w:color w:val="111111"/>
-          <w:sz w:val="28"/>
-          <w:szCs w:val="28"/>
-          <w:lang w:val="ru-RU"/>
-        </w:rPr>
-        <w:t xml:space="preserve"> </w:t>
-      </w:r>
-      <w:r>
-        <w:rPr>
-          <w:rFonts w:ascii="Times New Roman" w:eastAsia="Times New Roman" w:hAnsi="Times New Roman" w:cs="Times New Roman"/>
-          <w:color w:val="111111"/>
-          <w:sz w:val="28"/>
-          <w:szCs w:val="28"/>
-        </w:rPr>
-        <w:t> </w:t>
-      </w:r>
-      <w:r>
-        <w:rPr>
-          <w:rFonts w:ascii="Times New Roman" w:eastAsia="Times New Roman" w:hAnsi="Times New Roman" w:cs="Times New Roman"/>
-          <w:color w:val="111111"/>
-          <w:sz w:val="28"/>
-          <w:szCs w:val="28"/>
-          <w:lang w:val="ru-RU"/>
-        </w:rPr>
-        <w:t xml:space="preserve"> </w:t>
-      </w:r>
-      <w:r>
-        <w:rPr>
-          <w:rFonts w:ascii="Times New Roman" w:eastAsia="Times New Roman" w:hAnsi="Times New Roman" w:cs="Times New Roman"/>
-          <w:color w:val="111111"/>
-          <w:sz w:val="28"/>
-          <w:szCs w:val="28"/>
-        </w:rPr>
-        <w:t> </w:t>
-      </w:r>
-      <w:r>
-        <w:rPr>
-          <w:rFonts w:ascii="Times New Roman" w:eastAsia="Times New Roman" w:hAnsi="Times New Roman" w:cs="Times New Roman"/>
-          <w:color w:val="111111"/>
-          <w:sz w:val="28"/>
-          <w:szCs w:val="28"/>
-          <w:lang w:val="ru-RU"/>
-        </w:rPr>
-        <w:t xml:space="preserve"> </w:t>
-      </w:r>
-      <w:r>
-        <w:rPr>
-          <w:rFonts w:ascii="Times New Roman" w:eastAsia="Times New Roman" w:hAnsi="Times New Roman" w:cs="Times New Roman"/>
-          <w:color w:val="111111"/>
-          <w:sz w:val="28"/>
-          <w:szCs w:val="28"/>
-        </w:rPr>
-        <w:t> </w:t>
-      </w:r>
-      <w:r>
-        <w:rPr>
-          <w:rFonts w:ascii="Times New Roman" w:eastAsia="Times New Roman" w:hAnsi="Times New Roman" w:cs="Times New Roman"/>
-          <w:color w:val="111111"/>
-          <w:sz w:val="28"/>
-          <w:szCs w:val="28"/>
-          <w:lang w:val="ru-RU"/>
-        </w:rPr>
-        <w:t xml:space="preserve"> </w:t>
-      </w:r>
-      <w:r>
-        <w:rPr>
-          <w:rFonts w:ascii="Times New Roman" w:eastAsia="Times New Roman" w:hAnsi="Times New Roman" w:cs="Times New Roman"/>
-          <w:noProof/>
-          <w:color w:val="000000"/>
-          <w:sz w:val="28"/>
-          <w:szCs w:val="28"/>
-          <w:bdr w:val="single" w:sz="2" w:space="0" w:color="000000" w:frame="1"/>
-        </w:rPr>
-        <w:drawing>
-          <wp:inline distT="0" distB="0" distL="0" distR="0" wp14:anchorId="742A4414" wp14:editId="1482BA11">
-            <wp:extent cx="2286000" cy="1908810"/>
-            <wp:effectExtent l="19050" t="19050" r="19050" b="15240"/>
-            <wp:docPr id="3" name="Рисунок 3" descr="Нахлёсточное соединение."/>
-            <wp:cNvGraphicFramePr>
-              <a:graphicFrameLocks xmlns:a="http://schemas.openxmlformats.org/drawingml/2006/main" noChangeAspect="1"/>
-            </wp:cNvGraphicFramePr>
-            <a:graphic xmlns:a="http://schemas.openxmlformats.org/drawingml/2006/main">
-              <a:graphicData uri="http://schemas.openxmlformats.org/drawingml/2006/picture">
-                <pic:pic xmlns:pic="http://schemas.openxmlformats.org/drawingml/2006/picture">
-                  <pic:nvPicPr>
-                    <pic:cNvPr id="0" name="Picture 3" descr="Нахлёсточное соединение."/>
-                    <pic:cNvPicPr>
-                      <a:picLocks noChangeAspect="1" noChangeArrowheads="1"/>
-                    </pic:cNvPicPr>
-                  </pic:nvPicPr>
-                  <pic:blipFill rotWithShape="1">
-                    <a:blip r:embed="rId7">
-                      <a:extLst>
-                        <a:ext uri="{28A0092B-C50C-407E-A947-70E740481C1C}">
-                          <a14:useLocalDpi xmlns:a14="http://schemas.microsoft.com/office/drawing/2010/main" val="0"/>
-                        </a:ext>
-                      </a:extLst>
-                    </a:blip>
-                    <a:srcRect l="11242" t="1184"/>
-                    <a:stretch/>
-                  </pic:blipFill>
-                  <pic:spPr bwMode="auto">
-                    <a:xfrm>
-                      <a:off x="0" y="0"/>
-                      <a:ext cx="2286000" cy="1908810"/>
-                    </a:xfrm>
-                    <a:prstGeom prst="rect">
-                      <a:avLst/>
-                    </a:prstGeom>
-                    <a:noFill/>
-                    <a:ln>
-                      <a:solidFill>
-                        <a:schemeClr val="bg1"/>
-                      </a:solidFill>
-                    </a:ln>
-                    <a:extLst>
-                      <a:ext uri="{53640926-AAD7-44D8-BBD7-CCE9431645EC}">
-                        <a14:shadowObscured xmlns:a14="http://schemas.microsoft.com/office/drawing/2010/main"/>
-                      </a:ext>
-                    </a:extLst>
-                  </pic:spPr>
-                </pic:pic>
-              </a:graphicData>
-            </a:graphic>
-          </wp:inline>
-        </w:drawing>
+        <w:t> </w:t>
+      </w:r>
+      <w:r>
+        <w:rPr>
+          <w:rFonts w:ascii="Times New Roman" w:eastAsia="Times New Roman" w:hAnsi="Times New Roman" w:cs="Times New Roman"/>
+          <w:color w:val="111111"/>
+          <w:sz w:val="28"/>
+          <w:szCs w:val="28"/>
+          <w:lang w:val="ru-RU"/>
+        </w:rPr>
+        <w:t xml:space="preserve"> </w:t>
+      </w:r>
+      <w:r>
+        <w:rPr>
+          <w:rFonts w:ascii="Times New Roman" w:eastAsia="Times New Roman" w:hAnsi="Times New Roman" w:cs="Times New Roman"/>
+          <w:color w:val="111111"/>
+          <w:sz w:val="28"/>
+          <w:szCs w:val="28"/>
+        </w:rPr>
+        <w:t> </w:t>
+      </w:r>
+      <w:r>
+        <w:rPr>
+          <w:rFonts w:ascii="Times New Roman" w:eastAsia="Times New Roman" w:hAnsi="Times New Roman" w:cs="Times New Roman"/>
+          <w:color w:val="111111"/>
+          <w:sz w:val="28"/>
+          <w:szCs w:val="28"/>
+          <w:lang w:val="ru-RU"/>
+        </w:rPr>
+        <w:t xml:space="preserve"> </w:t>
+      </w:r>
+      <w:r>
+        <w:rPr>
+          <w:rFonts w:ascii="Times New Roman" w:eastAsia="Times New Roman" w:hAnsi="Times New Roman" w:cs="Times New Roman"/>
+          <w:color w:val="111111"/>
+          <w:sz w:val="28"/>
+          <w:szCs w:val="28"/>
+        </w:rPr>
+        <w:t> </w:t>
+      </w:r>
+      <w:r>
+        <w:rPr>
+          <w:rFonts w:ascii="Times New Roman" w:eastAsia="Times New Roman" w:hAnsi="Times New Roman" w:cs="Times New Roman"/>
+          <w:color w:val="111111"/>
+          <w:sz w:val="28"/>
+          <w:szCs w:val="28"/>
+          <w:lang w:val="ru-RU"/>
+        </w:rPr>
+        <w:t xml:space="preserve"> </w:t>
+      </w:r>
+      <w:r>
+        <w:rPr>
+          <w:rFonts w:ascii="Times New Roman" w:eastAsia="Times New Roman" w:hAnsi="Times New Roman" w:cs="Times New Roman"/>
+          <w:color w:val="111111"/>
+          <w:sz w:val="28"/>
+          <w:szCs w:val="28"/>
+        </w:rPr>
+        <w:t> </w:t>
+      </w:r>
+      <w:r>
+        <w:rPr>
+          <w:rFonts w:ascii="Times New Roman" w:eastAsia="Times New Roman" w:hAnsi="Times New Roman" w:cs="Times New Roman"/>
+          <w:color w:val="111111"/>
+          <w:sz w:val="28"/>
+          <w:szCs w:val="28"/>
+          <w:lang w:val="ru-RU"/>
+        </w:rPr>
+        <w:t xml:space="preserve"> </w:t>
+      </w:r>
+      <w:r>
+        <w:rPr>
+          <w:rFonts w:ascii="Times New Roman" w:eastAsia="Times New Roman" w:hAnsi="Times New Roman" w:cs="Times New Roman"/>
+          <w:color w:val="111111"/>
+          <w:sz w:val="28"/>
+          <w:szCs w:val="28"/>
+        </w:rPr>
+        <w:t> </w:t>
+      </w:r>
+      <w:r>
+        <w:rPr>
+          <w:rFonts w:ascii="Times New Roman" w:eastAsia="Times New Roman" w:hAnsi="Times New Roman" w:cs="Times New Roman"/>
+          <w:color w:val="111111"/>
+          <w:sz w:val="28"/>
+          <w:szCs w:val="28"/>
+          <w:lang w:val="ru-RU"/>
+        </w:rPr>
+        <w:t xml:space="preserve"> </w:t>
+      </w:r>
+      <w:r>
+        <w:rPr>
+          <w:rFonts w:ascii="Times New Roman" w:eastAsia="Times New Roman" w:hAnsi="Times New Roman" w:cs="Times New Roman"/>
+          <w:color w:val="111111"/>
+          <w:sz w:val="28"/>
+          <w:szCs w:val="28"/>
+        </w:rPr>
+        <w:t> </w:t>
+      </w:r>
+      <w:r>
+        <w:rPr>
+          <w:rFonts w:ascii="Times New Roman" w:eastAsia="Times New Roman" w:hAnsi="Times New Roman" w:cs="Times New Roman"/>
+          <w:color w:val="111111"/>
+          <w:sz w:val="28"/>
+          <w:szCs w:val="28"/>
+          <w:lang w:val="ru-RU"/>
+        </w:rPr>
+        <w:t xml:space="preserve"> </w:t>
+      </w:r>
+      <w:r>
+        <w:rPr>
+          <w:rFonts w:ascii="Times New Roman" w:eastAsia="Times New Roman" w:hAnsi="Times New Roman" w:cs="Times New Roman"/>
+          <w:color w:val="111111"/>
+          <w:sz w:val="28"/>
+          <w:szCs w:val="28"/>
+        </w:rPr>
+        <w:t> </w:t>
+      </w:r>
+      <w:r>
+        <w:rPr>
+          <w:rFonts w:ascii="Times New Roman" w:eastAsia="Times New Roman" w:hAnsi="Times New Roman" w:cs="Times New Roman"/>
+          <w:color w:val="111111"/>
+          <w:sz w:val="28"/>
+          <w:szCs w:val="28"/>
+          <w:lang w:val="ru-RU"/>
+        </w:rPr>
+        <w:t xml:space="preserve"> </w:t>
+      </w:r>
+      <w:r>
+        <w:rPr>
+          <w:rFonts w:ascii="Times New Roman" w:eastAsia="Times New Roman" w:hAnsi="Times New Roman" w:cs="Times New Roman"/>
+          <w:color w:val="111111"/>
+          <w:sz w:val="28"/>
+          <w:szCs w:val="28"/>
+        </w:rPr>
+        <w:t> </w:t>
+      </w:r>
+      <w:r>
+        <w:rPr>
+          <w:rFonts w:ascii="Times New Roman" w:eastAsia="Times New Roman" w:hAnsi="Times New Roman" w:cs="Times New Roman"/>
+          <w:color w:val="111111"/>
+          <w:sz w:val="28"/>
+          <w:szCs w:val="28"/>
+          <w:lang w:val="ru-RU"/>
+        </w:rPr>
+        <w:t xml:space="preserve"> </w:t>
+      </w:r>
+      <w:r>
+        <w:rPr>
+          <w:rFonts w:ascii="Times New Roman" w:eastAsia="Times New Roman" w:hAnsi="Times New Roman" w:cs="Times New Roman"/>
+          <w:color w:val="111111"/>
+          <w:sz w:val="28"/>
+          <w:szCs w:val="28"/>
+        </w:rPr>
+        <w:t> </w:t>
+      </w:r>
+      <w:r>
+        <w:rPr>
+          <w:rFonts w:ascii="Times New Roman" w:eastAsia="Times New Roman" w:hAnsi="Times New Roman" w:cs="Times New Roman"/>
+          <w:color w:val="111111"/>
+          <w:sz w:val="28"/>
+          <w:szCs w:val="28"/>
+          <w:lang w:val="ru-RU"/>
+        </w:rPr>
+        <w:t xml:space="preserve"> </w:t>
+      </w:r>
+      <w:r>
+        <w:rPr>
+          <w:rFonts w:ascii="Times New Roman" w:eastAsia="Times New Roman" w:hAnsi="Times New Roman" w:cs="Times New Roman"/>
+          <w:color w:val="111111"/>
+          <w:sz w:val="28"/>
+          <w:szCs w:val="28"/>
+        </w:rPr>
+        <w:t> </w:t>
+      </w:r>
+      <w:r>
+        <w:rPr>
+          <w:rFonts w:ascii="Times New Roman" w:eastAsia="Times New Roman" w:hAnsi="Times New Roman" w:cs="Times New Roman"/>
+          <w:color w:val="111111"/>
+          <w:sz w:val="28"/>
+          <w:szCs w:val="28"/>
+          <w:lang w:val="ru-RU"/>
+        </w:rPr>
+        <w:t xml:space="preserve"> </w:t>
+      </w:r>
+      <w:r>
+        <w:rPr>
+          <w:rFonts w:ascii="Times New Roman" w:eastAsia="Times New Roman" w:hAnsi="Times New Roman" w:cs="Times New Roman"/>
+          <w:color w:val="111111"/>
+          <w:sz w:val="28"/>
+          <w:szCs w:val="28"/>
+        </w:rPr>
+        <w:t> </w:t>
+      </w:r>
+      <w:r>
+        <w:rPr>
+          <w:rFonts w:ascii="Times New Roman" w:eastAsia="Times New Roman" w:hAnsi="Times New Roman" w:cs="Times New Roman"/>
+          <w:color w:val="111111"/>
+          <w:sz w:val="28"/>
+          <w:szCs w:val="28"/>
+          <w:lang w:val="ru-RU"/>
+        </w:rPr>
+        <w:t xml:space="preserve"> </w:t>
+      </w:r>
+      <w:r>
+        <w:rPr>
+          <w:rFonts w:ascii="Times New Roman" w:eastAsia="Times New Roman" w:hAnsi="Times New Roman" w:cs="Times New Roman"/>
+          <w:color w:val="111111"/>
+          <w:sz w:val="28"/>
+          <w:szCs w:val="28"/>
+        </w:rPr>
+        <w:t> </w:t>
+      </w:r>
+      <w:r>
+        <w:rPr>
+          <w:rFonts w:ascii="Times New Roman" w:eastAsia="Times New Roman" w:hAnsi="Times New Roman" w:cs="Times New Roman"/>
+          <w:color w:val="111111"/>
+          <w:sz w:val="28"/>
+          <w:szCs w:val="28"/>
+          <w:lang w:val="ru-RU"/>
+        </w:rPr>
+        <w:t xml:space="preserve"> </w:t>
+      </w:r>
+      <w:r>
+        <w:rPr>
+          <w:rFonts w:ascii="Times New Roman" w:eastAsia="Times New Roman" w:hAnsi="Times New Roman" w:cs="Times New Roman"/>
+          <w:color w:val="111111"/>
+          <w:sz w:val="28"/>
+          <w:szCs w:val="28"/>
+        </w:rPr>
+        <w:t> </w:t>
+      </w:r>
+      <w:r>
+        <w:rPr>
+          <w:rFonts w:ascii="Times New Roman" w:eastAsia="Times New Roman" w:hAnsi="Times New Roman" w:cs="Times New Roman"/>
+          <w:color w:val="111111"/>
+          <w:sz w:val="28"/>
+          <w:szCs w:val="28"/>
+          <w:lang w:val="ru-RU"/>
+        </w:rPr>
+        <w:t xml:space="preserve"> </w:t>
+      </w:r>
+      <w:r>
+        <w:rPr>
+          <w:rFonts w:ascii="Times New Roman" w:eastAsia="Times New Roman" w:hAnsi="Times New Roman" w:cs="Times New Roman"/>
+          <w:color w:val="111111"/>
+          <w:sz w:val="28"/>
+          <w:szCs w:val="28"/>
+        </w:rPr>
+        <w:t> </w:t>
+      </w:r>
+      <w:r>
+        <w:rPr>
+          <w:rFonts w:ascii="Times New Roman" w:eastAsia="Times New Roman" w:hAnsi="Times New Roman" w:cs="Times New Roman"/>
+          <w:color w:val="111111"/>
+          <w:sz w:val="28"/>
+          <w:szCs w:val="28"/>
+          <w:lang w:val="ru-RU"/>
+        </w:rPr>
+        <w:t xml:space="preserve"> </w:t>
+      </w:r>
+      <w:r>
+        <w:rPr>
+          <w:rFonts w:ascii="Times New Roman" w:eastAsia="Times New Roman" w:hAnsi="Times New Roman" w:cs="Times New Roman"/>
+          <w:color w:val="111111"/>
+          <w:sz w:val="28"/>
+          <w:szCs w:val="28"/>
+        </w:rPr>
+        <w:t> </w:t>
+      </w:r>
+      <w:r>
+        <w:rPr>
+          <w:rFonts w:ascii="Times New Roman" w:eastAsia="Times New Roman" w:hAnsi="Times New Roman" w:cs="Times New Roman"/>
+          <w:color w:val="111111"/>
+          <w:sz w:val="28"/>
+          <w:szCs w:val="28"/>
+          <w:lang w:val="ru-RU"/>
+        </w:rPr>
+        <w:t xml:space="preserve"> </w:t>
+      </w:r>
+      <w:r>
+        <w:rPr>
+          <w:rFonts w:ascii="Times New Roman" w:eastAsia="Times New Roman" w:hAnsi="Times New Roman" w:cs="Times New Roman"/>
+          <w:color w:val="111111"/>
+          <w:sz w:val="28"/>
+          <w:szCs w:val="28"/>
+        </w:rPr>
+        <w:t> </w:t>
+      </w:r>
+      <w:r>
+        <w:rPr>
+          <w:rFonts w:ascii="Times New Roman" w:eastAsia="Times New Roman" w:hAnsi="Times New Roman" w:cs="Times New Roman"/>
+          <w:color w:val="111111"/>
+          <w:sz w:val="28"/>
+          <w:szCs w:val="28"/>
+          <w:lang w:val="ru-RU"/>
+        </w:rPr>
+        <w:t xml:space="preserve"> </w:t>
+      </w:r>
+      <w:r>
+        <w:rPr>
+          <w:rFonts w:ascii="Times New Roman" w:eastAsia="Times New Roman" w:hAnsi="Times New Roman" w:cs="Times New Roman"/>
+          <w:color w:val="111111"/>
+          <w:sz w:val="28"/>
+          <w:szCs w:val="28"/>
+        </w:rPr>
+        <w:t> </w:t>
+      </w:r>
+      <w:r>
+        <w:rPr>
+          <w:rFonts w:ascii="Times New Roman" w:eastAsia="Times New Roman" w:hAnsi="Times New Roman" w:cs="Times New Roman"/>
+          <w:color w:val="111111"/>
+          <w:sz w:val="28"/>
+          <w:szCs w:val="28"/>
+          <w:lang w:val="ru-RU"/>
+        </w:rPr>
+        <w:t xml:space="preserve"> </w:t>
+      </w:r>
+      <w:r>
+        <w:rPr>
+          <w:rFonts w:ascii="Times New Roman" w:eastAsia="Times New Roman" w:hAnsi="Times New Roman" w:cs="Times New Roman"/>
+          <w:color w:val="111111"/>
+          <w:sz w:val="28"/>
+          <w:szCs w:val="28"/>
+        </w:rPr>
+        <w:t> </w:t>
+      </w:r>
+      <w:r>
+        <w:rPr>
+          <w:rFonts w:ascii="Times New Roman" w:eastAsia="Times New Roman" w:hAnsi="Times New Roman" w:cs="Times New Roman"/>
+          <w:color w:val="111111"/>
+          <w:sz w:val="28"/>
+          <w:szCs w:val="28"/>
+          <w:lang w:val="ru-RU"/>
+        </w:rPr>
+        <w:t xml:space="preserve"> </w:t>
+      </w:r>
+      <w:r>
+        <w:rPr>
+          <w:rFonts w:ascii="Times New Roman" w:eastAsia="Times New Roman" w:hAnsi="Times New Roman" w:cs="Times New Roman"/>
+          <w:color w:val="111111"/>
+          <w:sz w:val="28"/>
+          <w:szCs w:val="28"/>
+        </w:rPr>
+        <w:t> </w:t>
+      </w:r>
+      <w:r>
+        <w:rPr>
+          <w:rFonts w:ascii="Times New Roman" w:eastAsia="Times New Roman" w:hAnsi="Times New Roman" w:cs="Times New Roman"/>
+          <w:color w:val="111111"/>
+          <w:sz w:val="28"/>
+          <w:szCs w:val="28"/>
+          <w:lang w:val="ru-RU"/>
+        </w:rPr>
+        <w:t xml:space="preserve"> </w:t>
       </w:r>
       <w:r>
         <w:rPr>
@@ -4288,60 +4290,6 @@
         </w:rPr>
         <w:t>  </w:t>
       </w:r>
-    </w:p>
-    <w:p>
-      <w:pPr>
-        <w:shd w:val="clear" w:color="auto" w:fill="FFFFFF"/>
-        <w:spacing w:after="0" w:line="240" w:lineRule="auto"/>
-        <w:ind w:left="-142" w:firstLine="142"/>
-        <w:jc w:val="both"/>
-        <w:rPr>
-          <w:rFonts w:ascii="Times New Roman" w:eastAsia="Times New Roman" w:hAnsi="Times New Roman" w:cs="Times New Roman"/>
-          <w:color w:val="000000"/>
-          <w:sz w:val="28"/>
-          <w:szCs w:val="28"/>
-        </w:rPr>
-      </w:pPr>
-      <w:r>
-        <w:rPr>
-          <w:rFonts w:ascii="Times New Roman" w:eastAsia="Times New Roman" w:hAnsi="Times New Roman" w:cs="Times New Roman"/>
-          <w:color w:val="111111"/>
-          <w:sz w:val="28"/>
-          <w:szCs w:val="28"/>
-        </w:rPr>
-        <w:t xml:space="preserve">                                                 Рис.3 </w:t>
-      </w:r>
-      <w:proofErr w:type="spellStart"/>
-      <w:r>
-        <w:rPr>
-          <w:rFonts w:ascii="Times New Roman" w:eastAsia="Times New Roman" w:hAnsi="Times New Roman" w:cs="Times New Roman"/>
-          <w:color w:val="111111"/>
-          <w:sz w:val="28"/>
-          <w:szCs w:val="28"/>
-        </w:rPr>
-        <w:t>Нахлесточное</w:t>
-      </w:r>
-      <w:proofErr w:type="spellEnd"/>
-      <w:r>
-        <w:rPr>
-          <w:rFonts w:ascii="Times New Roman" w:eastAsia="Times New Roman" w:hAnsi="Times New Roman" w:cs="Times New Roman"/>
-          <w:color w:val="111111"/>
-          <w:sz w:val="28"/>
-          <w:szCs w:val="28"/>
-        </w:rPr>
-        <w:t xml:space="preserve"> </w:t>
-      </w:r>
-      <w:proofErr w:type="spellStart"/>
-      <w:r>
-        <w:rPr>
-          <w:rFonts w:ascii="Times New Roman" w:eastAsia="Times New Roman" w:hAnsi="Times New Roman" w:cs="Times New Roman"/>
-          <w:color w:val="111111"/>
-          <w:sz w:val="28"/>
-          <w:szCs w:val="28"/>
-        </w:rPr>
-        <w:t>соединение</w:t>
-      </w:r>
-      <w:proofErr w:type="spellEnd"/>
     </w:p>
     <w:p>
       <w:pPr>
@@ -4383,16 +4331,16 @@
           <w:color w:val="000000"/>
           <w:sz w:val="28"/>
           <w:szCs w:val="28"/>
-        </w:rPr>
-      </w:pPr>
-      <w:r>
-        <w:rPr>
-          <w:rFonts w:ascii="Times New Roman" w:eastAsia="Times New Roman" w:hAnsi="Times New Roman" w:cs="Times New Roman"/>
-          <w:color w:val="111111"/>
-          <w:sz w:val="28"/>
-          <w:szCs w:val="28"/>
-        </w:rPr>
-        <w:lastRenderedPageBreak/>
+          <w:lang w:val="ru-RU"/>
+        </w:rPr>
+      </w:pPr>
+      <w:r>
+        <w:rPr>
+          <w:rFonts w:ascii="Times New Roman" w:eastAsia="Times New Roman" w:hAnsi="Times New Roman" w:cs="Times New Roman"/>
+          <w:color w:val="111111"/>
+          <w:sz w:val="28"/>
+          <w:szCs w:val="28"/>
+        </w:rPr>
         <w:t> </w:t>
       </w:r>
       <w:r>
@@ -4793,66 +4741,6 @@
           <w:szCs w:val="28"/>
         </w:rPr>
         <w:t>  </w:t>
-      </w:r>
-      <w:r>
-        <w:rPr>
-          <w:rFonts w:ascii="Times New Roman" w:eastAsia="Times New Roman" w:hAnsi="Times New Roman" w:cs="Times New Roman"/>
-          <w:noProof/>
-          <w:color w:val="000000"/>
-          <w:sz w:val="28"/>
-          <w:szCs w:val="28"/>
-          <w:bdr w:val="single" w:sz="2" w:space="0" w:color="000000" w:frame="1"/>
-        </w:rPr>
-        <w:drawing>
-          <wp:inline distT="0" distB="0" distL="0" distR="0" wp14:anchorId="219DCC28" wp14:editId="67C74EDF">
-            <wp:extent cx="2255520" cy="1691640"/>
-            <wp:effectExtent l="19050" t="19050" r="11430" b="22860"/>
-            <wp:docPr id="4" name="Рисунок 4" descr="Угловое соединение."/>
-            <wp:cNvGraphicFramePr>
-              <a:graphicFrameLocks xmlns:a="http://schemas.openxmlformats.org/drawingml/2006/main" noChangeAspect="1"/>
-            </wp:cNvGraphicFramePr>
-            <a:graphic xmlns:a="http://schemas.openxmlformats.org/drawingml/2006/main">
-              <a:graphicData uri="http://schemas.openxmlformats.org/drawingml/2006/picture">
-                <pic:pic xmlns:pic="http://schemas.openxmlformats.org/drawingml/2006/picture">
-                  <pic:nvPicPr>
-                    <pic:cNvPr id="0" name="Picture 4" descr="Угловое соединение."/>
-                    <pic:cNvPicPr>
-                      <a:picLocks noChangeAspect="1" noChangeArrowheads="1"/>
-                    </pic:cNvPicPr>
-                  </pic:nvPicPr>
-                  <pic:blipFill>
-                    <a:blip r:embed="rId6">
-                      <a:extLst>
-                        <a:ext uri="{28A0092B-C50C-407E-A947-70E740481C1C}">
-                          <a14:useLocalDpi xmlns:a14="http://schemas.microsoft.com/office/drawing/2010/main" val="0"/>
-                        </a:ext>
-                      </a:extLst>
-                    </a:blip>
-                    <a:srcRect/>
-                    <a:stretch>
-                      <a:fillRect/>
-                    </a:stretch>
-                  </pic:blipFill>
-                  <pic:spPr bwMode="auto">
-                    <a:xfrm>
-                      <a:off x="0" y="0"/>
-                      <a:ext cx="2255520" cy="1691640"/>
-                    </a:xfrm>
-                    <a:prstGeom prst="rect">
-                      <a:avLst/>
-                    </a:prstGeom>
-                    <a:noFill/>
-                    <a:ln>
-                      <a:solidFill>
-                        <a:schemeClr val="bg1"/>
-                      </a:solidFill>
-                    </a:ln>
-                  </pic:spPr>
-                </pic:pic>
-              </a:graphicData>
-            </a:graphic>
-          </wp:inline>
-        </w:drawing>
       </w:r>
     </w:p>
     <w:p>
@@ -5361,7 +5249,7 @@
           <w:szCs w:val="28"/>
           <w:lang w:val="ru-RU"/>
         </w:rPr>
-        <w:t xml:space="preserve"> Рис.4 Угловое соединение</w:t>
+        <w:t xml:space="preserve"> </w:t>
       </w:r>
     </w:p>
     <w:p>
@@ -5945,224 +5833,21 @@
           <w:lang w:val="ru-RU"/>
         </w:rPr>
       </w:pPr>
-      <w:r>
-        <w:fldChar w:fldCharType="begin"/>
-      </w:r>
-      <w:r>
-        <w:rPr>
-          <w:lang w:val="ru-RU"/>
-        </w:rPr>
-        <w:instrText xml:space="preserve"> </w:instrText>
-      </w:r>
-      <w:r>
-        <w:instrText>HYPERLINK</w:instrText>
-      </w:r>
-      <w:r>
-        <w:rPr>
-          <w:lang w:val="ru-RU"/>
-        </w:rPr>
-        <w:instrText xml:space="preserve"> "</w:instrText>
-      </w:r>
-      <w:r>
-        <w:instrText>https</w:instrText>
-      </w:r>
-      <w:r>
-        <w:rPr>
-          <w:lang w:val="ru-RU"/>
-        </w:rPr>
-        <w:instrText>://</w:instrText>
-      </w:r>
-      <w:r>
-        <w:instrText>www</w:instrText>
-      </w:r>
-      <w:r>
-        <w:rPr>
-          <w:lang w:val="ru-RU"/>
-        </w:rPr>
-        <w:instrText>.</w:instrText>
-      </w:r>
-      <w:r>
-        <w:instrText>google</w:instrText>
-      </w:r>
-      <w:r>
-        <w:rPr>
-          <w:lang w:val="ru-RU"/>
-        </w:rPr>
-        <w:instrText>.</w:instrText>
-      </w:r>
-      <w:r>
-        <w:instrText>com</w:instrText>
-      </w:r>
-      <w:r>
-        <w:rPr>
-          <w:lang w:val="ru-RU"/>
-        </w:rPr>
-        <w:instrText>/</w:instrText>
-      </w:r>
-      <w:r>
-        <w:instrText>url</w:instrText>
-      </w:r>
-      <w:r>
-        <w:rPr>
-          <w:lang w:val="ru-RU"/>
-        </w:rPr>
-        <w:instrText>?</w:instrText>
-      </w:r>
-      <w:r>
-        <w:instrText>q</w:instrText>
-      </w:r>
-      <w:r>
-        <w:rPr>
-          <w:lang w:val="ru-RU"/>
-        </w:rPr>
-        <w:instrText>=</w:instrText>
-      </w:r>
-      <w:r>
-        <w:instrText>https</w:instrText>
-      </w:r>
-      <w:r>
-        <w:rPr>
-          <w:lang w:val="ru-RU"/>
-        </w:rPr>
-        <w:instrText>://</w:instrText>
-      </w:r>
-      <w:r>
-        <w:instrText>www</w:instrText>
-      </w:r>
-      <w:r>
-        <w:rPr>
-          <w:lang w:val="ru-RU"/>
-        </w:rPr>
-        <w:instrText>.</w:instrText>
-      </w:r>
-      <w:r>
-        <w:instrText>inmet</w:instrText>
-      </w:r>
-      <w:r>
-        <w:rPr>
-          <w:lang w:val="ru-RU"/>
-        </w:rPr>
-        <w:instrText>16.</w:instrText>
-      </w:r>
-      <w:r>
-        <w:instrText>ru</w:instrText>
-      </w:r>
-      <w:r>
-        <w:rPr>
-          <w:lang w:val="ru-RU"/>
-        </w:rPr>
-        <w:instrText>/</w:instrText>
-      </w:r>
-      <w:r>
-        <w:instrText>metallokonstrukcii</w:instrText>
-      </w:r>
-      <w:r>
-        <w:rPr>
-          <w:lang w:val="ru-RU"/>
-        </w:rPr>
-        <w:instrText>/&amp;</w:instrText>
-      </w:r>
-      <w:r>
-        <w:instrText>sa</w:instrText>
-      </w:r>
-      <w:r>
-        <w:rPr>
-          <w:lang w:val="ru-RU"/>
-        </w:rPr>
-        <w:instrText>=</w:instrText>
-      </w:r>
-      <w:r>
-        <w:instrText>D</w:instrText>
-      </w:r>
-      <w:r>
-        <w:rPr>
-          <w:lang w:val="ru-RU"/>
-        </w:rPr>
-        <w:instrText>&amp;</w:instrText>
-      </w:r>
-      <w:r>
-        <w:instrText>source</w:instrText>
-      </w:r>
-      <w:r>
-        <w:rPr>
-          <w:lang w:val="ru-RU"/>
-        </w:rPr>
-        <w:instrText>=</w:instrText>
-      </w:r>
-      <w:r>
-        <w:instrText>editors</w:instrText>
-      </w:r>
-      <w:r>
-        <w:rPr>
-          <w:lang w:val="ru-RU"/>
-        </w:rPr>
-        <w:instrText>&amp;</w:instrText>
-      </w:r>
-      <w:r>
-        <w:instrText>ust</w:instrText>
-      </w:r>
-      <w:r>
-        <w:rPr>
-          <w:lang w:val="ru-RU"/>
-        </w:rPr>
-        <w:instrText>=1667677683942280&amp;</w:instrText>
-      </w:r>
-      <w:r>
-        <w:instrText>usg</w:instrText>
-      </w:r>
-      <w:r>
-        <w:rPr>
-          <w:lang w:val="ru-RU"/>
-        </w:rPr>
-        <w:instrText>=</w:instrText>
-      </w:r>
-      <w:r>
-        <w:instrText>AOvVaw</w:instrText>
-      </w:r>
-      <w:r>
-        <w:rPr>
-          <w:lang w:val="ru-RU"/>
-        </w:rPr>
-        <w:instrText>3</w:instrText>
-      </w:r>
-      <w:r>
-        <w:instrText>UFuRiNxbicwqlxrhbyMz</w:instrText>
-      </w:r>
-      <w:r>
-        <w:rPr>
-          <w:lang w:val="ru-RU"/>
-        </w:rPr>
-        <w:instrText xml:space="preserve">-" </w:instrText>
-      </w:r>
-      <w:r>
-        <w:fldChar w:fldCharType="separate"/>
-      </w:r>
-      <w:r>
-        <w:rPr>
-          <w:rFonts w:ascii="Times New Roman" w:eastAsia="Times New Roman" w:hAnsi="Times New Roman" w:cs="Times New Roman"/>
-          <w:b/>
-          <w:bCs/>
-          <w:color w:val="0000FF"/>
-          <w:sz w:val="28"/>
-          <w:szCs w:val="28"/>
-          <w:u w:val="single"/>
-          <w:lang w:val="ru-RU"/>
-        </w:rPr>
-        <w:t>Металлоконструкции</w:t>
-      </w:r>
-      <w:r>
-        <w:rPr>
-          <w:rFonts w:ascii="Times New Roman" w:eastAsia="Times New Roman" w:hAnsi="Times New Roman" w:cs="Times New Roman"/>
-          <w:b/>
-          <w:bCs/>
-          <w:color w:val="0000FF"/>
-          <w:sz w:val="28"/>
-          <w:szCs w:val="28"/>
-          <w:u w:val="single"/>
-          <w:lang w:val="ru-RU"/>
-        </w:rPr>
-        <w:fldChar w:fldCharType="end"/>
-      </w:r>
+      <w:hyperlink r:id="rId5" w:history="1">
+        <w:r>
+          <w:rPr>
+            <w:rFonts w:ascii="Times New Roman" w:eastAsia="Times New Roman" w:hAnsi="Times New Roman" w:cs="Times New Roman"/>
+            <w:b/>
+            <w:bCs/>
+            <w:color w:val="0000FF"/>
+            <w:sz w:val="28"/>
+            <w:szCs w:val="28"/>
+            <w:u w:val="single"/>
+            <w:lang w:val="ru-RU"/>
+          </w:rPr>
+          <w:t>Металлоконструкции</w:t>
+        </w:r>
+      </w:hyperlink>
       <w:r>
         <w:rPr>
           <w:rFonts w:ascii="Times New Roman" w:eastAsia="Times New Roman" w:hAnsi="Times New Roman" w:cs="Times New Roman"/>
@@ -7105,520 +6790,33 @@
           <w:lang w:val="ru-RU"/>
         </w:rPr>
       </w:pPr>
-      <w:r>
-        <w:fldChar w:fldCharType="begin"/>
-      </w:r>
-      <w:r>
-        <w:rPr>
-          <w:lang w:val="ru-RU"/>
-        </w:rPr>
-        <w:instrText xml:space="preserve"> </w:instrText>
-      </w:r>
-      <w:r>
-        <w:instrText>HYPERLINK</w:instrText>
-      </w:r>
-      <w:r>
-        <w:rPr>
-          <w:lang w:val="ru-RU"/>
-        </w:rPr>
-        <w:instrText xml:space="preserve"> "</w:instrText>
-      </w:r>
-      <w:r>
-        <w:instrText>https</w:instrText>
-      </w:r>
-      <w:r>
-        <w:rPr>
-          <w:lang w:val="ru-RU"/>
-        </w:rPr>
-        <w:instrText>://</w:instrText>
-      </w:r>
-      <w:r>
-        <w:instrText>www</w:instrText>
-      </w:r>
-      <w:r>
-        <w:rPr>
-          <w:lang w:val="ru-RU"/>
-        </w:rPr>
-        <w:instrText>.</w:instrText>
-      </w:r>
-      <w:r>
-        <w:instrText>google</w:instrText>
-      </w:r>
-      <w:r>
-        <w:rPr>
-          <w:lang w:val="ru-RU"/>
-        </w:rPr>
-        <w:instrText>.</w:instrText>
-      </w:r>
-      <w:r>
-        <w:instrText>com</w:instrText>
-      </w:r>
-      <w:r>
-        <w:rPr>
-          <w:lang w:val="ru-RU"/>
-        </w:rPr>
-        <w:instrText>/</w:instrText>
-      </w:r>
-      <w:r>
-        <w:instrText>url</w:instrText>
-      </w:r>
-      <w:r>
-        <w:rPr>
-          <w:lang w:val="ru-RU"/>
-        </w:rPr>
-        <w:instrText>?</w:instrText>
-      </w:r>
-      <w:r>
-        <w:instrText>q</w:instrText>
-      </w:r>
-      <w:r>
-        <w:rPr>
-          <w:lang w:val="ru-RU"/>
-        </w:rPr>
-        <w:instrText>=</w:instrText>
-      </w:r>
-      <w:r>
-        <w:instrText>https</w:instrText>
-      </w:r>
-      <w:r>
-        <w:rPr>
-          <w:lang w:val="ru-RU"/>
-        </w:rPr>
-        <w:instrText>://</w:instrText>
-      </w:r>
-      <w:r>
-        <w:instrText>www</w:instrText>
-      </w:r>
-      <w:r>
-        <w:rPr>
-          <w:lang w:val="ru-RU"/>
-        </w:rPr>
-        <w:instrText>.</w:instrText>
-      </w:r>
-      <w:r>
-        <w:instrText>inmet</w:instrText>
-      </w:r>
-      <w:r>
-        <w:rPr>
-          <w:lang w:val="ru-RU"/>
-        </w:rPr>
-        <w:instrText>16.</w:instrText>
-      </w:r>
-      <w:r>
-        <w:instrText>ru</w:instrText>
-      </w:r>
-      <w:r>
-        <w:rPr>
-          <w:lang w:val="ru-RU"/>
-        </w:rPr>
-        <w:instrText>/</w:instrText>
-      </w:r>
-      <w:r>
-        <w:instrText>svarnaya</w:instrText>
-      </w:r>
-      <w:r>
-        <w:rPr>
-          <w:lang w:val="ru-RU"/>
-        </w:rPr>
-        <w:instrText>-</w:instrText>
-      </w:r>
-      <w:r>
-        <w:instrText>balka</w:instrText>
-      </w:r>
-      <w:r>
-        <w:rPr>
-          <w:lang w:val="ru-RU"/>
-        </w:rPr>
-        <w:instrText>/&amp;</w:instrText>
-      </w:r>
-      <w:r>
-        <w:instrText>sa</w:instrText>
-      </w:r>
-      <w:r>
-        <w:rPr>
-          <w:lang w:val="ru-RU"/>
-        </w:rPr>
-        <w:instrText>=</w:instrText>
-      </w:r>
-      <w:r>
-        <w:instrText>D</w:instrText>
-      </w:r>
-      <w:r>
-        <w:rPr>
-          <w:lang w:val="ru-RU"/>
-        </w:rPr>
-        <w:instrText>&amp;</w:instrText>
-      </w:r>
-      <w:r>
-        <w:instrText>source</w:instrText>
-      </w:r>
-      <w:r>
-        <w:rPr>
-          <w:lang w:val="ru-RU"/>
-        </w:rPr>
-        <w:instrText>=</w:instrText>
-      </w:r>
-      <w:r>
-        <w:instrText>editors</w:instrText>
-      </w:r>
-      <w:r>
-        <w:rPr>
-          <w:lang w:val="ru-RU"/>
-        </w:rPr>
-        <w:instrText>&amp;</w:instrText>
-      </w:r>
-      <w:r>
-        <w:instrText>ust</w:instrText>
-      </w:r>
-      <w:r>
-        <w:rPr>
-          <w:lang w:val="ru-RU"/>
-        </w:rPr>
-        <w:instrText>=1667677683945722&amp;</w:instrText>
-      </w:r>
-      <w:r>
-        <w:instrText>usg</w:instrText>
-      </w:r>
-      <w:r>
-        <w:rPr>
-          <w:lang w:val="ru-RU"/>
-        </w:rPr>
-        <w:instrText>=</w:instrText>
-      </w:r>
-      <w:r>
-        <w:instrText>AOvVaw</w:instrText>
-      </w:r>
-      <w:r>
-        <w:rPr>
-          <w:lang w:val="ru-RU"/>
-        </w:rPr>
-        <w:instrText>1</w:instrText>
-      </w:r>
-      <w:r>
-        <w:instrText>ydrI</w:instrText>
-      </w:r>
-      <w:r>
-        <w:rPr>
-          <w:lang w:val="ru-RU"/>
-        </w:rPr>
-        <w:instrText>-</w:instrText>
-      </w:r>
-      <w:r>
-        <w:instrText>x</w:instrText>
-      </w:r>
-      <w:r>
-        <w:rPr>
-          <w:lang w:val="ru-RU"/>
-        </w:rPr>
-        <w:instrText>-</w:instrText>
-      </w:r>
-      <w:r>
-        <w:instrText>Msshviw</w:instrText>
-      </w:r>
-      <w:r>
-        <w:rPr>
-          <w:lang w:val="ru-RU"/>
-        </w:rPr>
-        <w:instrText>-</w:instrText>
-      </w:r>
-      <w:r>
-        <w:instrText>k</w:instrText>
-      </w:r>
-      <w:r>
-        <w:rPr>
-          <w:lang w:val="ru-RU"/>
-        </w:rPr>
-        <w:instrText>3</w:instrText>
-      </w:r>
-      <w:r>
-        <w:instrText>Q</w:instrText>
-      </w:r>
-      <w:r>
-        <w:rPr>
-          <w:lang w:val="ru-RU"/>
-        </w:rPr>
-        <w:instrText>18</w:instrText>
-      </w:r>
-      <w:r>
-        <w:instrText>w</w:instrText>
-      </w:r>
-      <w:r>
-        <w:rPr>
-          <w:lang w:val="ru-RU"/>
-        </w:rPr>
-        <w:instrText xml:space="preserve">" </w:instrText>
-      </w:r>
-      <w:r>
-        <w:fldChar w:fldCharType="separate"/>
-      </w:r>
-      <w:r>
-        <w:rPr>
-          <w:rFonts w:ascii="Times New Roman" w:eastAsia="Times New Roman" w:hAnsi="Times New Roman" w:cs="Times New Roman"/>
-          <w:color w:val="0000FF"/>
-          <w:sz w:val="28"/>
-          <w:szCs w:val="28"/>
-          <w:u w:val="single"/>
-          <w:lang w:val="ru-RU"/>
-        </w:rPr>
-        <w:t>Балки</w:t>
-      </w:r>
-      <w:r>
-        <w:rPr>
-          <w:rFonts w:ascii="Times New Roman" w:eastAsia="Times New Roman" w:hAnsi="Times New Roman" w:cs="Times New Roman"/>
-          <w:color w:val="0000FF"/>
-          <w:sz w:val="28"/>
-          <w:szCs w:val="28"/>
-          <w:u w:val="single"/>
-          <w:lang w:val="ru-RU"/>
-        </w:rPr>
-        <w:fldChar w:fldCharType="end"/>
-      </w:r>
-      <w:r>
-        <w:fldChar w:fldCharType="begin"/>
-      </w:r>
-      <w:r>
-        <w:rPr>
-          <w:lang w:val="ru-RU"/>
-        </w:rPr>
-        <w:instrText xml:space="preserve"> </w:instrText>
-      </w:r>
-      <w:r>
-        <w:instrText>HYPERLINK</w:instrText>
-      </w:r>
-      <w:r>
-        <w:rPr>
-          <w:lang w:val="ru-RU"/>
-        </w:rPr>
-        <w:instrText xml:space="preserve"> "</w:instrText>
-      </w:r>
-      <w:r>
-        <w:instrText>https</w:instrText>
-      </w:r>
-      <w:r>
-        <w:rPr>
-          <w:lang w:val="ru-RU"/>
-        </w:rPr>
-        <w:instrText>://</w:instrText>
-      </w:r>
-      <w:r>
-        <w:instrText>www</w:instrText>
-      </w:r>
-      <w:r>
-        <w:rPr>
-          <w:lang w:val="ru-RU"/>
-        </w:rPr>
-        <w:instrText>.</w:instrText>
-      </w:r>
-      <w:r>
-        <w:instrText>google</w:instrText>
-      </w:r>
-      <w:r>
-        <w:rPr>
-          <w:lang w:val="ru-RU"/>
-        </w:rPr>
-        <w:instrText>.</w:instrText>
-      </w:r>
-      <w:r>
-        <w:instrText>com</w:instrText>
-      </w:r>
-      <w:r>
-        <w:rPr>
-          <w:lang w:val="ru-RU"/>
-        </w:rPr>
-        <w:instrText>/</w:instrText>
-      </w:r>
-      <w:r>
-        <w:instrText>url</w:instrText>
-      </w:r>
-      <w:r>
-        <w:rPr>
-          <w:lang w:val="ru-RU"/>
-        </w:rPr>
-        <w:instrText>?</w:instrText>
-      </w:r>
-      <w:r>
-        <w:instrText>q</w:instrText>
-      </w:r>
-      <w:r>
-        <w:rPr>
-          <w:lang w:val="ru-RU"/>
-        </w:rPr>
-        <w:instrText>=</w:instrText>
-      </w:r>
-      <w:r>
-        <w:instrText>https</w:instrText>
-      </w:r>
-      <w:r>
-        <w:rPr>
-          <w:lang w:val="ru-RU"/>
-        </w:rPr>
-        <w:instrText>://</w:instrText>
-      </w:r>
-      <w:r>
-        <w:instrText>www</w:instrText>
-      </w:r>
-      <w:r>
-        <w:rPr>
-          <w:lang w:val="ru-RU"/>
-        </w:rPr>
-        <w:instrText>.</w:instrText>
-      </w:r>
-      <w:r>
-        <w:instrText>inmet</w:instrText>
-      </w:r>
-      <w:r>
-        <w:rPr>
-          <w:lang w:val="ru-RU"/>
-        </w:rPr>
-        <w:instrText>16.</w:instrText>
-      </w:r>
-      <w:r>
-        <w:instrText>ru</w:instrText>
-      </w:r>
-      <w:r>
-        <w:rPr>
-          <w:lang w:val="ru-RU"/>
-        </w:rPr>
-        <w:instrText>/</w:instrText>
-      </w:r>
-      <w:r>
-        <w:instrText>svarnaya</w:instrText>
-      </w:r>
-      <w:r>
-        <w:rPr>
-          <w:lang w:val="ru-RU"/>
-        </w:rPr>
-        <w:instrText>-</w:instrText>
-      </w:r>
-      <w:r>
-        <w:instrText>balka</w:instrText>
-      </w:r>
-      <w:r>
-        <w:rPr>
-          <w:lang w:val="ru-RU"/>
-        </w:rPr>
-        <w:instrText>/&amp;</w:instrText>
-      </w:r>
-      <w:r>
-        <w:instrText>sa</w:instrText>
-      </w:r>
-      <w:r>
-        <w:rPr>
-          <w:lang w:val="ru-RU"/>
-        </w:rPr>
-        <w:instrText>=</w:instrText>
-      </w:r>
-      <w:r>
-        <w:instrText>D</w:instrText>
-      </w:r>
-      <w:r>
-        <w:rPr>
-          <w:lang w:val="ru-RU"/>
-        </w:rPr>
-        <w:instrText>&amp;</w:instrText>
-      </w:r>
-      <w:r>
-        <w:instrText>source</w:instrText>
-      </w:r>
-      <w:r>
-        <w:rPr>
-          <w:lang w:val="ru-RU"/>
-        </w:rPr>
-        <w:instrText>=</w:instrText>
-      </w:r>
-      <w:r>
-        <w:instrText>e</w:instrText>
-      </w:r>
-      <w:r>
-        <w:instrText>ditors</w:instrText>
-      </w:r>
-      <w:r>
-        <w:rPr>
-          <w:lang w:val="ru-RU"/>
-        </w:rPr>
-        <w:instrText>&amp;</w:instrText>
-      </w:r>
-      <w:r>
-        <w:instrText>ust</w:instrText>
-      </w:r>
-      <w:r>
-        <w:rPr>
-          <w:lang w:val="ru-RU"/>
-        </w:rPr>
-        <w:instrText>=1667677683946009&amp;</w:instrText>
-      </w:r>
-      <w:r>
-        <w:instrText>usg</w:instrText>
-      </w:r>
-      <w:r>
-        <w:rPr>
-          <w:lang w:val="ru-RU"/>
-        </w:rPr>
-        <w:instrText>=</w:instrText>
-      </w:r>
-      <w:r>
-        <w:instrText>AOvVaw</w:instrText>
-      </w:r>
-      <w:r>
-        <w:rPr>
-          <w:lang w:val="ru-RU"/>
-        </w:rPr>
-        <w:instrText>2</w:instrText>
-      </w:r>
-      <w:r>
-        <w:instrText>p</w:instrText>
-      </w:r>
-      <w:r>
-        <w:rPr>
-          <w:lang w:val="ru-RU"/>
-        </w:rPr>
-        <w:instrText>5</w:instrText>
-      </w:r>
-      <w:r>
-        <w:instrText>sdtCoiyfCQqXhAW</w:instrText>
-      </w:r>
-      <w:r>
-        <w:rPr>
-          <w:lang w:val="ru-RU"/>
-        </w:rPr>
-        <w:instrText>0</w:instrText>
-      </w:r>
-      <w:r>
-        <w:instrText>T</w:instrText>
-      </w:r>
-      <w:r>
-        <w:rPr>
-          <w:lang w:val="ru-RU"/>
-        </w:rPr>
-        <w:instrText xml:space="preserve">44" </w:instrText>
-      </w:r>
-      <w:r>
-        <w:fldChar w:fldCharType="separate"/>
-      </w:r>
-      <w:r>
-        <w:rPr>
-          <w:rFonts w:ascii="Times New Roman" w:eastAsia="Times New Roman" w:hAnsi="Times New Roman" w:cs="Times New Roman"/>
-          <w:b/>
-          <w:bCs/>
-          <w:color w:val="0000FF"/>
-          <w:sz w:val="28"/>
-          <w:szCs w:val="28"/>
-          <w:u w:val="single"/>
-        </w:rPr>
-        <w:t> </w:t>
-      </w:r>
-      <w:r>
-        <w:rPr>
-          <w:rFonts w:ascii="Times New Roman" w:eastAsia="Times New Roman" w:hAnsi="Times New Roman" w:cs="Times New Roman"/>
-          <w:b/>
-          <w:bCs/>
-          <w:color w:val="0000FF"/>
-          <w:sz w:val="28"/>
-          <w:szCs w:val="28"/>
-          <w:u w:val="single"/>
-        </w:rPr>
-        <w:fldChar w:fldCharType="end"/>
-      </w:r>
+      <w:hyperlink r:id="rId6" w:history="1">
+        <w:r>
+          <w:rPr>
+            <w:rFonts w:ascii="Times New Roman" w:eastAsia="Times New Roman" w:hAnsi="Times New Roman" w:cs="Times New Roman"/>
+            <w:color w:val="0000FF"/>
+            <w:sz w:val="28"/>
+            <w:szCs w:val="28"/>
+            <w:u w:val="single"/>
+            <w:lang w:val="ru-RU"/>
+          </w:rPr>
+          <w:t>Балки</w:t>
+        </w:r>
+      </w:hyperlink>
+      <w:hyperlink r:id="rId7" w:history="1">
+        <w:r>
+          <w:rPr>
+            <w:rFonts w:ascii="Times New Roman" w:eastAsia="Times New Roman" w:hAnsi="Times New Roman" w:cs="Times New Roman"/>
+            <w:b/>
+            <w:bCs/>
+            <w:color w:val="0000FF"/>
+            <w:sz w:val="28"/>
+            <w:szCs w:val="28"/>
+            <w:u w:val="single"/>
+          </w:rPr>
+          <w:t> </w:t>
+        </w:r>
+      </w:hyperlink>
       <w:r>
         <w:rPr>
           <w:rFonts w:ascii="Times New Roman" w:eastAsia="Times New Roman" w:hAnsi="Times New Roman" w:cs="Times New Roman"/>
@@ -7985,274 +7183,19 @@
           <w:lang w:val="ru-RU"/>
         </w:rPr>
       </w:pPr>
-      <w:r>
-        <w:fldChar w:fldCharType="begin"/>
-      </w:r>
-      <w:r>
-        <w:rPr>
-          <w:lang w:val="ru-RU"/>
-        </w:rPr>
-        <w:instrText xml:space="preserve"> </w:instrText>
-      </w:r>
-      <w:r>
-        <w:instrText>HYPERLINK</w:instrText>
-      </w:r>
-      <w:r>
-        <w:rPr>
-          <w:lang w:val="ru-RU"/>
-        </w:rPr>
-        <w:instrText xml:space="preserve"> "</w:instrText>
-      </w:r>
-      <w:r>
-        <w:instrText>https</w:instrText>
-      </w:r>
-      <w:r>
-        <w:rPr>
-          <w:lang w:val="ru-RU"/>
-        </w:rPr>
-        <w:instrText>://</w:instrText>
-      </w:r>
-      <w:r>
-        <w:instrText>www</w:instrText>
-      </w:r>
-      <w:r>
-        <w:rPr>
-          <w:lang w:val="ru-RU"/>
-        </w:rPr>
-        <w:instrText>.</w:instrText>
-      </w:r>
-      <w:r>
-        <w:instrText>google</w:instrText>
-      </w:r>
-      <w:r>
-        <w:rPr>
-          <w:lang w:val="ru-RU"/>
-        </w:rPr>
-        <w:instrText>.</w:instrText>
-      </w:r>
-      <w:r>
-        <w:instrText>com</w:instrText>
-      </w:r>
-      <w:r>
-        <w:rPr>
-          <w:lang w:val="ru-RU"/>
-        </w:rPr>
-        <w:instrText>/</w:instrText>
-      </w:r>
-      <w:r>
-        <w:instrText>url</w:instrText>
-      </w:r>
-      <w:r>
-        <w:rPr>
-          <w:lang w:val="ru-RU"/>
-        </w:rPr>
-        <w:instrText>?</w:instrText>
-      </w:r>
-      <w:r>
-        <w:instrText>q</w:instrText>
-      </w:r>
-      <w:r>
-        <w:rPr>
-          <w:lang w:val="ru-RU"/>
-        </w:rPr>
-        <w:instrText>=</w:instrText>
-      </w:r>
-      <w:r>
-        <w:instrText>https</w:instrText>
-      </w:r>
-      <w:r>
-        <w:rPr>
-          <w:lang w:val="ru-RU"/>
-        </w:rPr>
-        <w:instrText>://</w:instrText>
-      </w:r>
-      <w:r>
-        <w:instrText>www</w:instrText>
-      </w:r>
-      <w:r>
-        <w:rPr>
-          <w:lang w:val="ru-RU"/>
-        </w:rPr>
-        <w:instrText>.</w:instrText>
-      </w:r>
-      <w:r>
-        <w:instrText>inmet</w:instrText>
-      </w:r>
-      <w:r>
-        <w:rPr>
-          <w:lang w:val="ru-RU"/>
-        </w:rPr>
-        <w:instrText>16.</w:instrText>
-      </w:r>
-      <w:r>
-        <w:instrText>ru</w:instrText>
-      </w:r>
-      <w:r>
-        <w:rPr>
-          <w:lang w:val="ru-RU"/>
-        </w:rPr>
-        <w:instrText>/</w:instrText>
-      </w:r>
-      <w:r>
-        <w:instrText>svarnye</w:instrText>
-      </w:r>
-      <w:r>
-        <w:rPr>
-          <w:lang w:val="ru-RU"/>
-        </w:rPr>
-        <w:instrText>-</w:instrText>
-      </w:r>
-      <w:r>
-        <w:instrText>kolonny</w:instrText>
-      </w:r>
-      <w:r>
-        <w:rPr>
-          <w:lang w:val="ru-RU"/>
-        </w:rPr>
-        <w:instrText>/&amp;</w:instrText>
-      </w:r>
-      <w:r>
-        <w:instrText>sa</w:instrText>
-      </w:r>
-      <w:r>
-        <w:rPr>
-          <w:lang w:val="ru-RU"/>
-        </w:rPr>
-        <w:instrText>=</w:instrText>
-      </w:r>
-      <w:r>
-        <w:instrText>D</w:instrText>
-      </w:r>
-      <w:r>
-        <w:rPr>
-          <w:lang w:val="ru-RU"/>
-        </w:rPr>
-        <w:instrText>&amp;</w:instrText>
-      </w:r>
-      <w:r>
-        <w:instrText>source</w:instrText>
-      </w:r>
-      <w:r>
-        <w:rPr>
-          <w:lang w:val="ru-RU"/>
-        </w:rPr>
-        <w:instrText>=</w:instrText>
-      </w:r>
-      <w:r>
-        <w:instrText>editors</w:instrText>
-      </w:r>
-      <w:r>
-        <w:rPr>
-          <w:lang w:val="ru-RU"/>
-        </w:rPr>
-        <w:instrText>&amp;</w:instrText>
-      </w:r>
-      <w:r>
-        <w:instrText>ust</w:instrText>
-      </w:r>
-      <w:r>
-        <w:rPr>
-          <w:lang w:val="ru-RU"/>
-        </w:rPr>
-        <w:instrText>=1667677683947332&amp;</w:instrText>
-      </w:r>
-      <w:r>
-        <w:instrText>usg</w:instrText>
-      </w:r>
-      <w:r>
-        <w:rPr>
-          <w:lang w:val="ru-RU"/>
-        </w:rPr>
-        <w:instrText>=</w:instrText>
-      </w:r>
-      <w:r>
-        <w:instrText>AOvVaw</w:instrText>
-      </w:r>
-      <w:r>
-        <w:rPr>
-          <w:lang w:val="ru-RU"/>
-        </w:rPr>
-        <w:instrText>1</w:instrText>
-      </w:r>
-      <w:r>
-        <w:instrText>Y</w:instrText>
-      </w:r>
-      <w:r>
-        <w:rPr>
-          <w:lang w:val="ru-RU"/>
-        </w:rPr>
-        <w:instrText>04</w:instrText>
-      </w:r>
-      <w:r>
-        <w:instrText>xs</w:instrText>
-      </w:r>
-      <w:r>
-        <w:rPr>
-          <w:lang w:val="ru-RU"/>
-        </w:rPr>
-        <w:instrText>8</w:instrText>
-      </w:r>
-      <w:r>
-        <w:instrText>jPgUZ</w:instrText>
-      </w:r>
-      <w:r>
-        <w:rPr>
-          <w:lang w:val="ru-RU"/>
-        </w:rPr>
-        <w:instrText>-</w:instrText>
-      </w:r>
-      <w:r>
-        <w:instrText>B</w:instrText>
-      </w:r>
-      <w:r>
-        <w:rPr>
-          <w:lang w:val="ru-RU"/>
-        </w:rPr>
-        <w:instrText>7</w:instrText>
-      </w:r>
-      <w:r>
-        <w:instrText>i</w:instrText>
-      </w:r>
-      <w:r>
-        <w:rPr>
-          <w:lang w:val="ru-RU"/>
-        </w:rPr>
-        <w:instrText>7</w:instrText>
-      </w:r>
-      <w:r>
-        <w:instrText>jbzwn</w:instrText>
-      </w:r>
-      <w:r>
-        <w:rPr>
-          <w:lang w:val="ru-RU"/>
-        </w:rPr>
-        <w:instrText xml:space="preserve">" </w:instrText>
-      </w:r>
-      <w:r>
-        <w:fldChar w:fldCharType="separate"/>
-      </w:r>
-      <w:r>
-        <w:rPr>
-          <w:rFonts w:ascii="Times New Roman" w:eastAsia="Times New Roman" w:hAnsi="Times New Roman" w:cs="Times New Roman"/>
-          <w:color w:val="0000FF"/>
-          <w:sz w:val="28"/>
-          <w:szCs w:val="28"/>
-          <w:u w:val="single"/>
-          <w:lang w:val="ru-RU"/>
-        </w:rPr>
-        <w:t>Колонны</w:t>
-      </w:r>
-      <w:r>
-        <w:rPr>
-          <w:rFonts w:ascii="Times New Roman" w:eastAsia="Times New Roman" w:hAnsi="Times New Roman" w:cs="Times New Roman"/>
-          <w:color w:val="0000FF"/>
-          <w:sz w:val="28"/>
-          <w:szCs w:val="28"/>
-          <w:u w:val="single"/>
-          <w:lang w:val="ru-RU"/>
-        </w:rPr>
-        <w:fldChar w:fldCharType="end"/>
-      </w:r>
+      <w:hyperlink r:id="rId8" w:history="1">
+        <w:r>
+          <w:rPr>
+            <w:rFonts w:ascii="Times New Roman" w:eastAsia="Times New Roman" w:hAnsi="Times New Roman" w:cs="Times New Roman"/>
+            <w:color w:val="0000FF"/>
+            <w:sz w:val="28"/>
+            <w:szCs w:val="28"/>
+            <w:u w:val="single"/>
+            <w:lang w:val="ru-RU"/>
+          </w:rPr>
+          <w:t>Колонны</w:t>
+        </w:r>
+      </w:hyperlink>
       <w:r>
         <w:rPr>
           <w:rFonts w:ascii="Times New Roman" w:eastAsia="Times New Roman" w:hAnsi="Times New Roman" w:cs="Times New Roman"/>
@@ -11712,7 +10655,6 @@
           <w:szCs w:val="28"/>
           <w:lang w:val="ru-RU"/>
         </w:rPr>
-        <w:lastRenderedPageBreak/>
         <w:t>строительные</w:t>
       </w:r>
       <w:r>
@@ -11828,15 +10770,15 @@
           <w:lang w:val="ru-RU"/>
         </w:rPr>
       </w:pPr>
-      <w:proofErr w:type="gramStart"/>
-      <w:r>
-        <w:rPr>
-          <w:rFonts w:ascii="Times New Roman" w:eastAsia="Times New Roman" w:hAnsi="Times New Roman" w:cs="Times New Roman"/>
-          <w:color w:val="000000"/>
-          <w:sz w:val="28"/>
-          <w:szCs w:val="28"/>
-          <w:lang w:val="ru-RU"/>
-        </w:rPr>
+      <w:r>
+        <w:rPr>
+          <w:rFonts w:ascii="Times New Roman" w:eastAsia="Times New Roman" w:hAnsi="Times New Roman" w:cs="Times New Roman"/>
+          <w:color w:val="000000"/>
+          <w:sz w:val="28"/>
+          <w:szCs w:val="28"/>
+          <w:lang w:val="ru-RU"/>
+        </w:rPr>
+        <w:lastRenderedPageBreak/>
         <w:t>трубопроводы</w:t>
       </w:r>
       <w:r>
@@ -11862,7 +10804,6 @@
         </w:rPr>
         <w:t>.</w:t>
       </w:r>
-      <w:proofErr w:type="gramEnd"/>
     </w:p>
     <w:p>
       <w:pPr>
@@ -12232,64 +11173,6 @@
         </w:rPr>
         <w:t> </w:t>
       </w:r>
-      <w:r>
-        <w:rPr>
-          <w:rFonts w:ascii="Times New Roman" w:eastAsia="Times New Roman" w:hAnsi="Times New Roman" w:cs="Times New Roman"/>
-          <w:noProof/>
-          <w:color w:val="000000"/>
-          <w:sz w:val="28"/>
-          <w:szCs w:val="28"/>
-          <w:bdr w:val="single" w:sz="2" w:space="0" w:color="000000" w:frame="1"/>
-        </w:rPr>
-        <w:drawing>
-          <wp:inline distT="0" distB="0" distL="0" distR="0" wp14:anchorId="3DADCC5C" wp14:editId="0E2D85E5">
-            <wp:extent cx="4643120" cy="3482340"/>
-            <wp:effectExtent l="0" t="0" r="5080" b="3810"/>
-            <wp:docPr id="5" name="Рисунок 5" descr="Типовые детали и сборочные единицы машиностроительных изделий и приборов Сл..."/>
-            <wp:cNvGraphicFramePr>
-              <a:graphicFrameLocks xmlns:a="http://schemas.openxmlformats.org/drawingml/2006/main" noChangeAspect="1"/>
-            </wp:cNvGraphicFramePr>
-            <a:graphic xmlns:a="http://schemas.openxmlformats.org/drawingml/2006/main">
-              <a:graphicData uri="http://schemas.openxmlformats.org/drawingml/2006/picture">
-                <pic:pic xmlns:pic="http://schemas.openxmlformats.org/drawingml/2006/picture">
-                  <pic:nvPicPr>
-                    <pic:cNvPr id="0" name="Picture 5" descr="Типовые детали и сборочные единицы машиностроительных изделий и приборов Сл..."/>
-                    <pic:cNvPicPr>
-                      <a:picLocks noChangeAspect="1" noChangeArrowheads="1"/>
-                    </pic:cNvPicPr>
-                  </pic:nvPicPr>
-                  <pic:blipFill>
-                    <a:blip r:embed="rId8">
-                      <a:extLst>
-                        <a:ext uri="{28A0092B-C50C-407E-A947-70E740481C1C}">
-                          <a14:useLocalDpi xmlns:a14="http://schemas.microsoft.com/office/drawing/2010/main" val="0"/>
-                        </a:ext>
-                      </a:extLst>
-                    </a:blip>
-                    <a:srcRect/>
-                    <a:stretch>
-                      <a:fillRect/>
-                    </a:stretch>
-                  </pic:blipFill>
-                  <pic:spPr bwMode="auto">
-                    <a:xfrm>
-                      <a:off x="0" y="0"/>
-                      <a:ext cx="4643120" cy="3482340"/>
-                    </a:xfrm>
-                    <a:prstGeom prst="rect">
-                      <a:avLst/>
-                    </a:prstGeom>
-                    <a:noFill/>
-                    <a:ln>
-                      <a:noFill/>
-                    </a:ln>
-                  </pic:spPr>
-                </pic:pic>
-              </a:graphicData>
-            </a:graphic>
-          </wp:inline>
-        </w:drawing>
-      </w:r>
     </w:p>
     <w:p>
       <w:pPr>
@@ -13570,66 +12453,7 @@
           <w:sz w:val="28"/>
           <w:szCs w:val="28"/>
         </w:rPr>
-        <w:lastRenderedPageBreak/>
         <w:t>                                   </w:t>
-      </w:r>
-      <w:r>
-        <w:rPr>
-          <w:rFonts w:ascii="Times New Roman" w:eastAsia="Times New Roman" w:hAnsi="Times New Roman" w:cs="Times New Roman"/>
-          <w:noProof/>
-          <w:color w:val="000000"/>
-          <w:sz w:val="28"/>
-          <w:szCs w:val="28"/>
-          <w:bdr w:val="single" w:sz="2" w:space="0" w:color="000000" w:frame="1"/>
-        </w:rPr>
-        <w:drawing>
-          <wp:inline distT="0" distB="0" distL="0" distR="0" wp14:anchorId="4F85B73E" wp14:editId="4415AD89">
-            <wp:extent cx="4008120" cy="4443592"/>
-            <wp:effectExtent l="0" t="0" r="0" b="0"/>
-            <wp:docPr id="6" name="Рисунок 6" descr="https://avatars.mds.yandex.net/get-images-cbir/1427918/byrA2SBonGN3-eN4AnVC4w452/ocr"/>
-            <wp:cNvGraphicFramePr>
-              <a:graphicFrameLocks xmlns:a="http://schemas.openxmlformats.org/drawingml/2006/main" noChangeAspect="1"/>
-            </wp:cNvGraphicFramePr>
-            <a:graphic xmlns:a="http://schemas.openxmlformats.org/drawingml/2006/main">
-              <a:graphicData uri="http://schemas.openxmlformats.org/drawingml/2006/picture">
-                <pic:pic xmlns:pic="http://schemas.openxmlformats.org/drawingml/2006/picture">
-                  <pic:nvPicPr>
-                    <pic:cNvPr id="0" name="Picture 6" descr="https://avatars.mds.yandex.net/get-images-cbir/1427918/byrA2SBonGN3-eN4AnVC4w452/ocr"/>
-                    <pic:cNvPicPr>
-                      <a:picLocks noChangeAspect="1" noChangeArrowheads="1"/>
-                    </pic:cNvPicPr>
-                  </pic:nvPicPr>
-                  <pic:blipFill>
-                    <a:blip r:embed="rId9">
-                      <a:extLst>
-                        <a:ext uri="{28A0092B-C50C-407E-A947-70E740481C1C}">
-                          <a14:useLocalDpi xmlns:a14="http://schemas.microsoft.com/office/drawing/2010/main" val="0"/>
-                        </a:ext>
-                      </a:extLst>
-                    </a:blip>
-                    <a:srcRect/>
-                    <a:stretch>
-                      <a:fillRect/>
-                    </a:stretch>
-                  </pic:blipFill>
-                  <pic:spPr bwMode="auto">
-                    <a:xfrm>
-                      <a:off x="0" y="0"/>
-                      <a:ext cx="4016054" cy="4452388"/>
-                    </a:xfrm>
-                    <a:prstGeom prst="rect">
-                      <a:avLst/>
-                    </a:prstGeom>
-                    <a:noFill/>
-                    <a:ln>
-                      <a:noFill/>
-                    </a:ln>
-                  </pic:spPr>
-                </pic:pic>
-              </a:graphicData>
-            </a:graphic>
-          </wp:inline>
-        </w:drawing>
       </w:r>
     </w:p>
     <w:p>
@@ -15941,7 +14765,6 @@
           <w:szCs w:val="28"/>
           <w:shd w:val="clear" w:color="auto" w:fill="FBFBFB"/>
         </w:rPr>
-        <w:lastRenderedPageBreak/>
         <w:t> </w:t>
       </w:r>
       <w:r>
@@ -16090,64 +14913,6 @@
           <w:shd w:val="clear" w:color="auto" w:fill="FBFBFB"/>
         </w:rPr>
         <w:t>  </w:t>
-      </w:r>
-      <w:r>
-        <w:rPr>
-          <w:rFonts w:ascii="Times New Roman" w:eastAsia="Times New Roman" w:hAnsi="Times New Roman" w:cs="Times New Roman"/>
-          <w:noProof/>
-          <w:color w:val="000000"/>
-          <w:sz w:val="28"/>
-          <w:szCs w:val="28"/>
-          <w:bdr w:val="single" w:sz="2" w:space="0" w:color="000000" w:frame="1"/>
-        </w:rPr>
-        <w:drawing>
-          <wp:inline distT="0" distB="0" distL="0" distR="0" wp14:anchorId="57D3ACD9" wp14:editId="4A53C990">
-            <wp:extent cx="4511040" cy="3915583"/>
-            <wp:effectExtent l="0" t="0" r="3810" b="8890"/>
-            <wp:docPr id="7" name="Рисунок 7" descr="https://avatars.mds.yandex.net/get-images-cbir/6083060/gu7hfDeq4INR1hNXGOH8pA640/ocr"/>
-            <wp:cNvGraphicFramePr>
-              <a:graphicFrameLocks xmlns:a="http://schemas.openxmlformats.org/drawingml/2006/main" noChangeAspect="1"/>
-            </wp:cNvGraphicFramePr>
-            <a:graphic xmlns:a="http://schemas.openxmlformats.org/drawingml/2006/main">
-              <a:graphicData uri="http://schemas.openxmlformats.org/drawingml/2006/picture">
-                <pic:pic xmlns:pic="http://schemas.openxmlformats.org/drawingml/2006/picture">
-                  <pic:nvPicPr>
-                    <pic:cNvPr id="0" name="Picture 7" descr="https://avatars.mds.yandex.net/get-images-cbir/6083060/gu7hfDeq4INR1hNXGOH8pA640/ocr"/>
-                    <pic:cNvPicPr>
-                      <a:picLocks noChangeAspect="1" noChangeArrowheads="1"/>
-                    </pic:cNvPicPr>
-                  </pic:nvPicPr>
-                  <pic:blipFill>
-                    <a:blip r:embed="rId10">
-                      <a:extLst>
-                        <a:ext uri="{28A0092B-C50C-407E-A947-70E740481C1C}">
-                          <a14:useLocalDpi xmlns:a14="http://schemas.microsoft.com/office/drawing/2010/main" val="0"/>
-                        </a:ext>
-                      </a:extLst>
-                    </a:blip>
-                    <a:srcRect/>
-                    <a:stretch>
-                      <a:fillRect/>
-                    </a:stretch>
-                  </pic:blipFill>
-                  <pic:spPr bwMode="auto">
-                    <a:xfrm>
-                      <a:off x="0" y="0"/>
-                      <a:ext cx="4522476" cy="3925509"/>
-                    </a:xfrm>
-                    <a:prstGeom prst="rect">
-                      <a:avLst/>
-                    </a:prstGeom>
-                    <a:noFill/>
-                    <a:ln>
-                      <a:noFill/>
-                    </a:ln>
-                  </pic:spPr>
-                </pic:pic>
-              </a:graphicData>
-            </a:graphic>
-          </wp:inline>
-        </w:drawing>
       </w:r>
     </w:p>
     <w:p>
@@ -16878,75 +15643,7 @@
           <w:szCs w:val="28"/>
           <w:shd w:val="clear" w:color="auto" w:fill="FBFBFB"/>
         </w:rPr>
-        <w:t>  </w:t>
-      </w:r>
-      <w:r>
-        <w:rPr>
-          <w:rFonts w:ascii="Times New Roman" w:eastAsia="Times New Roman" w:hAnsi="Times New Roman" w:cs="Times New Roman"/>
-          <w:noProof/>
-          <w:color w:val="000000"/>
-          <w:sz w:val="28"/>
-          <w:szCs w:val="28"/>
-          <w:bdr w:val="single" w:sz="2" w:space="0" w:color="000000" w:frame="1"/>
-        </w:rPr>
-        <w:drawing>
-          <wp:inline distT="0" distB="0" distL="0" distR="0" wp14:anchorId="6E9AED2D" wp14:editId="7D729907">
-            <wp:extent cx="3810000" cy="1394460"/>
-            <wp:effectExtent l="0" t="0" r="0" b="0"/>
-            <wp:docPr id="8" name="Рисунок 8" descr="https://avatars.mds.yandex.net/get-images-cbir/7752126/EnwTD9Vj8TXs-mOLKFzuPg1178/ocr"/>
-            <wp:cNvGraphicFramePr>
-              <a:graphicFrameLocks xmlns:a="http://schemas.openxmlformats.org/drawingml/2006/main" noChangeAspect="1"/>
-            </wp:cNvGraphicFramePr>
-            <a:graphic xmlns:a="http://schemas.openxmlformats.org/drawingml/2006/main">
-              <a:graphicData uri="http://schemas.openxmlformats.org/drawingml/2006/picture">
-                <pic:pic xmlns:pic="http://schemas.openxmlformats.org/drawingml/2006/picture">
-                  <pic:nvPicPr>
-                    <pic:cNvPr id="0" name="Picture 8" descr="https://avatars.mds.yandex.net/get-images-cbir/7752126/EnwTD9Vj8TXs-mOLKFzuPg1178/ocr"/>
-                    <pic:cNvPicPr>
-                      <a:picLocks noChangeAspect="1" noChangeArrowheads="1"/>
-                    </pic:cNvPicPr>
-                  </pic:nvPicPr>
-                  <pic:blipFill>
-                    <a:blip r:embed="rId11">
-                      <a:extLst>
-                        <a:ext uri="{28A0092B-C50C-407E-A947-70E740481C1C}">
-                          <a14:useLocalDpi xmlns:a14="http://schemas.microsoft.com/office/drawing/2010/main" val="0"/>
-                        </a:ext>
-                      </a:extLst>
-                    </a:blip>
-                    <a:srcRect/>
-                    <a:stretch>
-                      <a:fillRect/>
-                    </a:stretch>
-                  </pic:blipFill>
-                  <pic:spPr bwMode="auto">
-                    <a:xfrm>
-                      <a:off x="0" y="0"/>
-                      <a:ext cx="3810000" cy="1394460"/>
-                    </a:xfrm>
-                    <a:prstGeom prst="rect">
-                      <a:avLst/>
-                    </a:prstGeom>
-                    <a:noFill/>
-                    <a:ln>
-                      <a:noFill/>
-                    </a:ln>
-                  </pic:spPr>
-                </pic:pic>
-              </a:graphicData>
-            </a:graphic>
-          </wp:inline>
-        </w:drawing>
-      </w:r>
-      <w:r>
-        <w:rPr>
-          <w:rFonts w:ascii="Times New Roman" w:eastAsia="Times New Roman" w:hAnsi="Times New Roman" w:cs="Times New Roman"/>
-          <w:color w:val="000000"/>
-          <w:sz w:val="28"/>
-          <w:szCs w:val="28"/>
-          <w:shd w:val="clear" w:color="auto" w:fill="FBFBFB"/>
-        </w:rPr>
-        <w:t> </w:t>
+        <w:t>   </w:t>
       </w:r>
     </w:p>
     <w:p>
@@ -18042,7 +16739,7 @@
 </file>
 
 <file path=word/numbering.xml><?xml version="1.0" encoding="utf-8"?>
-<w:numbering xmlns:wpc="http://schemas.microsoft.com/office/word/2010/wordprocessingCanvas" xmlns:cx="http://schemas.microsoft.com/office/drawing/2014/chartex" xmlns:mc="http://schemas.openxmlformats.org/markup-compatibility/2006" xmlns:o="urn:schemas-microsoft-com:office:office" xmlns:r="http://schemas.openxmlformats.org/officeDocument/2006/relationships" xmlns:m="http://schemas.openxmlformats.org/officeDocument/2006/math" xmlns:v="urn:schemas-microsoft-com:vml" xmlns:wp14="http://schemas.microsoft.com/office/word/2010/wordprocessingDrawing" xmlns:wp="http://schemas.openxmlformats.org/drawingml/2006/wordprocessingDrawing" xmlns:w10="urn:schemas-microsoft-com:office:word" xmlns:w="http://schemas.openxmlformats.org/wordprocessingml/2006/main" xmlns:w14="http://schemas.microsoft.com/office/word/2010/wordml" xmlns:w15="http://schemas.microsoft.com/office/word/2012/wordml" xmlns:w16se="http://schemas.microsoft.com/office/word/2015/wordml/symex" xmlns:wpg="http://schemas.microsoft.com/office/word/2010/wordprocessingGroup" xmlns:wpi="http://schemas.microsoft.com/office/word/2010/wordprocessingInk" xmlns:wne="http://schemas.microsoft.com/office/word/2006/wordml" xmlns:wps="http://schemas.microsoft.com/office/word/2010/wordprocessingShape" mc:Ignorable="w14 w15 w16se wp14">
+<w:numbering xmlns:wpc="http://schemas.microsoft.com/office/word/2010/wordprocessingCanvas" xmlns:cx="http://schemas.microsoft.com/office/drawing/2014/chartex" xmlns:cx1="http://schemas.microsoft.com/office/drawing/2015/9/8/chartex" xmlns:cx2="http://schemas.microsoft.com/office/drawing/2015/10/21/chartex" xmlns:cx3="http://schemas.microsoft.com/office/drawing/2016/5/9/chartex" xmlns:cx4="http://schemas.microsoft.com/office/drawing/2016/5/10/chartex" xmlns:cx5="http://schemas.microsoft.com/office/drawing/2016/5/11/chartex" xmlns:cx6="http://schemas.microsoft.com/office/drawing/2016/5/12/chartex" xmlns:cx7="http://schemas.microsoft.com/office/drawing/2016/5/13/chartex" xmlns:cx8="http://schemas.microsoft.com/office/drawing/2016/5/14/chartex" xmlns:mc="http://schemas.openxmlformats.org/markup-compatibility/2006" xmlns:aink="http://schemas.microsoft.com/office/drawing/2016/ink" xmlns:am3d="http://schemas.microsoft.com/office/drawing/2017/model3d" xmlns:o="urn:schemas-microsoft-com:office:office" xmlns:oel="http://schemas.microsoft.com/office/2019/extlst" xmlns:r="http://schemas.openxmlformats.org/officeDocument/2006/relationships" xmlns:m="http://schemas.openxmlformats.org/officeDocument/2006/math" xmlns:v="urn:schemas-microsoft-com:vml" xmlns:wp14="http://schemas.microsoft.com/office/word/2010/wordprocessingDrawing" xmlns:wp="http://schemas.openxmlformats.org/drawingml/2006/wordprocessingDrawing" xmlns:w10="urn:schemas-microsoft-com:office:word" xmlns:w="http://schemas.openxmlformats.org/wordprocessingml/2006/main" xmlns:w14="http://schemas.microsoft.com/office/word/2010/wordml" xmlns:w15="http://schemas.microsoft.com/office/word/2012/wordml" xmlns:w16cex="http://schemas.microsoft.com/office/word/2018/wordml/cex" xmlns:w16cid="http://schemas.microsoft.com/office/word/2016/wordml/cid" xmlns:w16="http://schemas.microsoft.com/office/word/2018/wordml" xmlns:w16sdtdh="http://schemas.microsoft.com/office/word/2020/wordml/sdtdatahash" xmlns:w16se="http://schemas.microsoft.com/office/word/2015/wordml/symex" xmlns:wpg="http://schemas.microsoft.com/office/word/2010/wordprocessingGroup" xmlns:wpi="http://schemas.microsoft.com/office/word/2010/wordprocessingInk" xmlns:wne="http://schemas.microsoft.com/office/word/2006/wordml" xmlns:wps="http://schemas.microsoft.com/office/word/2010/wordprocessingShape" mc:Ignorable="w14 w15 w16se w16cid w16 w16cex w16sdtdh wp14">
   <w:abstractNum w:abstractNumId="0" w15:restartNumberingAfterBreak="0">
     <w:nsid w:val="0AF74DF2"/>
     <w:multiLevelType w:val="hybridMultilevel"/>
@@ -19394,44 +18091,44 @@
       </w:pPr>
     </w:lvl>
   </w:abstractNum>
-  <w:num w:numId="1">
+  <w:num w:numId="1" w16cid:durableId="244612368">
     <w:abstractNumId w:val="8"/>
   </w:num>
-  <w:num w:numId="2">
+  <w:num w:numId="2" w16cid:durableId="1590893072">
     <w:abstractNumId w:val="5"/>
   </w:num>
-  <w:num w:numId="3">
+  <w:num w:numId="3" w16cid:durableId="534929341">
     <w:abstractNumId w:val="9"/>
   </w:num>
-  <w:num w:numId="4">
+  <w:num w:numId="4" w16cid:durableId="897126156">
     <w:abstractNumId w:val="1"/>
   </w:num>
-  <w:num w:numId="5">
+  <w:num w:numId="5" w16cid:durableId="758916037">
     <w:abstractNumId w:val="10"/>
   </w:num>
-  <w:num w:numId="6">
+  <w:num w:numId="6" w16cid:durableId="2131708073">
     <w:abstractNumId w:val="3"/>
   </w:num>
-  <w:num w:numId="7">
+  <w:num w:numId="7" w16cid:durableId="783967163">
     <w:abstractNumId w:val="6"/>
   </w:num>
-  <w:num w:numId="8">
+  <w:num w:numId="8" w16cid:durableId="300616879">
     <w:abstractNumId w:val="2"/>
   </w:num>
-  <w:num w:numId="9">
+  <w:num w:numId="9" w16cid:durableId="1679120245">
     <w:abstractNumId w:val="4"/>
   </w:num>
-  <w:num w:numId="10">
+  <w:num w:numId="10" w16cid:durableId="811941416">
     <w:abstractNumId w:val="7"/>
   </w:num>
-  <w:num w:numId="11">
+  <w:num w:numId="11" w16cid:durableId="794907447">
     <w:abstractNumId w:val="0"/>
   </w:num>
 </w:numbering>
 </file>
 
 <file path=word/styles.xml><?xml version="1.0" encoding="utf-8"?>
-<w:styles xmlns:mc="http://schemas.openxmlformats.org/markup-compatibility/2006" xmlns:r="http://schemas.openxmlformats.org/officeDocument/2006/relationships" xmlns:w="http://schemas.openxmlformats.org/wordprocessingml/2006/main" xmlns:w14="http://schemas.microsoft.com/office/word/2010/wordml" xmlns:w15="http://schemas.microsoft.com/office/word/2012/wordml" xmlns:w16se="http://schemas.microsoft.com/office/word/2015/wordml/symex" mc:Ignorable="w14 w15 w16se">
+<w:styles xmlns:mc="http://schemas.openxmlformats.org/markup-compatibility/2006" xmlns:r="http://schemas.openxmlformats.org/officeDocument/2006/relationships" xmlns:w="http://schemas.openxmlformats.org/wordprocessingml/2006/main" xmlns:w14="http://schemas.microsoft.com/office/word/2010/wordml" xmlns:w15="http://schemas.microsoft.com/office/word/2012/wordml" xmlns:w16cex="http://schemas.microsoft.com/office/word/2018/wordml/cex" xmlns:w16cid="http://schemas.microsoft.com/office/word/2016/wordml/cid" xmlns:w16="http://schemas.microsoft.com/office/word/2018/wordml" xmlns:w16sdtdh="http://schemas.microsoft.com/office/word/2020/wordml/sdtdatahash" xmlns:w16se="http://schemas.microsoft.com/office/word/2015/wordml/symex" mc:Ignorable="w14 w15 w16se w16cid w16 w16cex w16sdtdh">
   <w:docDefaults>
     <w:rPrDefault>
       <w:rPr>
@@ -19447,7 +18144,7 @@
       </w:pPr>
     </w:pPrDefault>
   </w:docDefaults>
-  <w:latentStyles w:defLockedState="0" w:defUIPriority="99" w:defSemiHidden="0" w:defUnhideWhenUsed="0" w:defQFormat="0" w:count="371">
+  <w:latentStyles w:defLockedState="0" w:defUIPriority="99" w:defSemiHidden="0" w:defUnhideWhenUsed="0" w:defQFormat="0" w:count="376">
     <w:lsdException w:name="Normal" w:uiPriority="0" w:qFormat="1"/>
     <w:lsdException w:name="heading 1" w:uiPriority="9" w:qFormat="1"/>
     <w:lsdException w:name="heading 2" w:semiHidden="1" w:uiPriority="9" w:unhideWhenUsed="1" w:qFormat="1"/>
@@ -19819,6 +18516,11 @@
     <w:lsdException w:name="List Table 5 Dark Accent 6" w:uiPriority="50"/>
     <w:lsdException w:name="List Table 6 Colorful Accent 6" w:uiPriority="51"/>
     <w:lsdException w:name="List Table 7 Colorful Accent 6" w:uiPriority="52"/>
+    <w:lsdException w:name="Mention" w:semiHidden="1" w:unhideWhenUsed="1"/>
+    <w:lsdException w:name="Smart Hyperlink" w:semiHidden="1" w:unhideWhenUsed="1"/>
+    <w:lsdException w:name="Hashtag" w:semiHidden="1" w:unhideWhenUsed="1"/>
+    <w:lsdException w:name="Unresolved Mention" w:semiHidden="1" w:unhideWhenUsed="1"/>
+    <w:lsdException w:name="Smart Link" w:semiHidden="1" w:unhideWhenUsed="1"/>
   </w:latentStyles>
   <w:style w:type="paragraph" w:default="1" w:styleId="a">
     <w:name w:val="Normal"/>

</xml_diff>